<commit_message>
Add Query 4 and 5 result interpretations
</commit_message>
<xml_diff>
--- a/stage 2/Blockchain_Payments_Stage2.docx
+++ b/stage 2/Blockchain_Payments_Stage2.docx
@@ -145,7 +145,7 @@
         </w:rPr>
         <w:t xml:space="preserve">GitHub:  </w:t>
       </w:r>
-      <w:hyperlink w:history="1" r:id="rIdir4yxtqq65xokfnd6eo8v">
+      <w:hyperlink w:history="1" r:id="rIdcf47l1su3-zkyxt7zakl4">
         <w:r>
           <w:rPr>
             <w:rFonts w:ascii="Arial" w:cs="Arial" w:eastAsia="Arial" w:hAnsi="Arial"/>
@@ -2613,83 +2613,352 @@
           <w:sz w:val="20"/>
           <w:szCs w:val="20"/>
         </w:rPr>
-        <w:t xml:space="preserve">Blockchain timestamps are stored as TIMESTAMP WITH TIME ZONE. Standard SQL date functions work, but Dune adds blockchain-specific time functions:</w:t>
-      </w:r>
-    </w:p>
-    <w:p>
-      <w:pPr>
-        <w:spacing w:after="80" w:before="80"/>
-      </w:pPr>
-      <w:r>
-        <w:t xml:space="preserve"/>
-      </w:r>
-    </w:p>
-    <w:p>
-      <w:pPr>
-        <w:spacing w:after="40" w:before="40"/>
-        <w:ind w:left="360"/>
-      </w:pPr>
-      <w:r>
-        <w:rPr>
-          <w:rFonts w:ascii="Courier New" w:cs="Courier New" w:eastAsia="Courier New" w:hAnsi="Courier New"/>
-          <w:color w:val="2C3E6B"/>
-          <w:sz w:val="18"/>
-          <w:szCs w:val="18"/>
-        </w:rPr>
-        <w:t xml:space="preserve">-- Filter transactions in the last 30 days</w:t>
-      </w:r>
-    </w:p>
-    <w:p>
-      <w:pPr>
-        <w:spacing w:after="40" w:before="40"/>
-        <w:ind w:left="360"/>
-      </w:pPr>
-      <w:r>
-        <w:rPr>
-          <w:rFonts w:ascii="Courier New" w:cs="Courier New" w:eastAsia="Courier New" w:hAnsi="Courier New"/>
-          <w:color w:val="2C3E6B"/>
-          <w:sz w:val="18"/>
-          <w:szCs w:val="18"/>
-        </w:rPr>
-        <w:t xml:space="preserve">WHERE block_time &gt;= NOW() - INTERVAL '30' DAY</w:t>
-      </w:r>
-    </w:p>
-    <w:p>
-      <w:pPr>
-        <w:spacing w:after="80" w:before="80"/>
-      </w:pPr>
-      <w:r>
-        <w:t xml:space="preserve"/>
-      </w:r>
-    </w:p>
-    <w:p>
-      <w:pPr>
-        <w:spacing w:after="40" w:before="40"/>
-        <w:ind w:left="360"/>
-      </w:pPr>
-      <w:r>
-        <w:rPr>
-          <w:rFonts w:ascii="Courier New" w:cs="Courier New" w:eastAsia="Courier New" w:hAnsi="Courier New"/>
-          <w:color w:val="2C3E6B"/>
-          <w:sz w:val="18"/>
-          <w:szCs w:val="18"/>
-        </w:rPr>
-        <w:t xml:space="preserve">-- Truncate to day for daily aggregation</w:t>
-      </w:r>
-    </w:p>
-    <w:p>
-      <w:pPr>
-        <w:spacing w:after="40" w:before="40"/>
-        <w:ind w:left="360"/>
-      </w:pPr>
-      <w:r>
-        <w:rPr>
-          <w:rFonts w:ascii="Courier New" w:cs="Courier New" w:eastAsia="Courier New" w:hAnsi="Courier New"/>
-          <w:color w:val="2C3E6B"/>
-          <w:sz w:val="18"/>
-          <w:szCs w:val="18"/>
-        </w:rPr>
-        <w:t xml:space="preserve">DATE_TRUNC('day', block_time) AS date</w:t>
+        <w:t xml:space="preserve">Blockchain timestamps are stored as TIMESTAMP WITH TIME ZONE. Standard SQL date functions work, but Dune adds blockchain-specific time functions. Below are two complete working examples — not code snippets, but full queries you can run directly on Dune:</w:t>
+      </w:r>
+    </w:p>
+    <w:p>
+      <w:pPr>
+        <w:spacing w:after="80" w:before="80"/>
+      </w:pPr>
+      <w:r>
+        <w:t xml:space="preserve"/>
+      </w:r>
+    </w:p>
+    <w:p>
+      <w:pPr>
+        <w:spacing w:after="60" w:before="60"/>
+      </w:pPr>
+      <w:r>
+        <w:rPr>
+          <w:rFonts w:ascii="Arial" w:cs="Arial" w:eastAsia="Arial" w:hAnsi="Arial"/>
+          <w:color w:val="222222"/>
+          <w:sz w:val="20"/>
+          <w:szCs w:val="20"/>
+        </w:rPr>
+        <w:t xml:space="preserve">Example 1: Retrieve the 10 most recent transactions (also Query 1 in Section 4):</w:t>
+      </w:r>
+    </w:p>
+    <w:p>
+      <w:pPr>
+        <w:spacing w:after="80" w:before="80"/>
+      </w:pPr>
+      <w:r>
+        <w:t xml:space="preserve"/>
+      </w:r>
+    </w:p>
+    <w:p>
+      <w:pPr>
+        <w:spacing w:after="40" w:before="40"/>
+        <w:ind w:left="360"/>
+      </w:pPr>
+      <w:r>
+        <w:rPr>
+          <w:rFonts w:ascii="Courier New" w:cs="Courier New" w:eastAsia="Courier New" w:hAnsi="Courier New"/>
+          <w:color w:val="2C3E6B"/>
+          <w:sz w:val="18"/>
+          <w:szCs w:val="18"/>
+        </w:rPr>
+        <w:t xml:space="preserve">SELECT</w:t>
+      </w:r>
+    </w:p>
+    <w:p>
+      <w:pPr>
+        <w:spacing w:after="40" w:before="40"/>
+        <w:ind w:left="360"/>
+      </w:pPr>
+      <w:r>
+        <w:rPr>
+          <w:rFonts w:ascii="Courier New" w:cs="Courier New" w:eastAsia="Courier New" w:hAnsi="Courier New"/>
+          <w:color w:val="2C3E6B"/>
+          <w:sz w:val="18"/>
+          <w:szCs w:val="18"/>
+        </w:rPr>
+        <w:t xml:space="preserve">    hash,</w:t>
+      </w:r>
+    </w:p>
+    <w:p>
+      <w:pPr>
+        <w:spacing w:after="40" w:before="40"/>
+        <w:ind w:left="360"/>
+      </w:pPr>
+      <w:r>
+        <w:rPr>
+          <w:rFonts w:ascii="Courier New" w:cs="Courier New" w:eastAsia="Courier New" w:hAnsi="Courier New"/>
+          <w:color w:val="2C3E6B"/>
+          <w:sz w:val="18"/>
+          <w:szCs w:val="18"/>
+        </w:rPr>
+        <w:t xml:space="preserve">    block_time,</w:t>
+      </w:r>
+    </w:p>
+    <w:p>
+      <w:pPr>
+        <w:spacing w:after="40" w:before="40"/>
+        <w:ind w:left="360"/>
+      </w:pPr>
+      <w:r>
+        <w:rPr>
+          <w:rFonts w:ascii="Courier New" w:cs="Courier New" w:eastAsia="Courier New" w:hAnsi="Courier New"/>
+          <w:color w:val="2C3E6B"/>
+          <w:sz w:val="18"/>
+          <w:szCs w:val="18"/>
+        </w:rPr>
+        <w:t xml:space="preserve">    "from",</w:t>
+      </w:r>
+    </w:p>
+    <w:p>
+      <w:pPr>
+        <w:spacing w:after="40" w:before="40"/>
+        <w:ind w:left="360"/>
+      </w:pPr>
+      <w:r>
+        <w:rPr>
+          <w:rFonts w:ascii="Courier New" w:cs="Courier New" w:eastAsia="Courier New" w:hAnsi="Courier New"/>
+          <w:color w:val="2C3E6B"/>
+          <w:sz w:val="18"/>
+          <w:szCs w:val="18"/>
+        </w:rPr>
+        <w:t xml:space="preserve">    "to",</w:t>
+      </w:r>
+    </w:p>
+    <w:p>
+      <w:pPr>
+        <w:spacing w:after="40" w:before="40"/>
+        <w:ind w:left="360"/>
+      </w:pPr>
+      <w:r>
+        <w:rPr>
+          <w:rFonts w:ascii="Courier New" w:cs="Courier New" w:eastAsia="Courier New" w:hAnsi="Courier New"/>
+          <w:color w:val="2C3E6B"/>
+          <w:sz w:val="18"/>
+          <w:szCs w:val="18"/>
+        </w:rPr>
+        <w:t xml:space="preserve">    value / 1e18 AS eth_value,</w:t>
+      </w:r>
+    </w:p>
+    <w:p>
+      <w:pPr>
+        <w:spacing w:after="40" w:before="40"/>
+        <w:ind w:left="360"/>
+      </w:pPr>
+      <w:r>
+        <w:rPr>
+          <w:rFonts w:ascii="Courier New" w:cs="Courier New" w:eastAsia="Courier New" w:hAnsi="Courier New"/>
+          <w:color w:val="2C3E6B"/>
+          <w:sz w:val="18"/>
+          <w:szCs w:val="18"/>
+        </w:rPr>
+        <w:t xml:space="preserve">    gas_used,</w:t>
+      </w:r>
+    </w:p>
+    <w:p>
+      <w:pPr>
+        <w:spacing w:after="40" w:before="40"/>
+        <w:ind w:left="360"/>
+      </w:pPr>
+      <w:r>
+        <w:rPr>
+          <w:rFonts w:ascii="Courier New" w:cs="Courier New" w:eastAsia="Courier New" w:hAnsi="Courier New"/>
+          <w:color w:val="2C3E6B"/>
+          <w:sz w:val="18"/>
+          <w:szCs w:val="18"/>
+        </w:rPr>
+        <w:t xml:space="preserve">    gas_price / 1e9 AS gas_price_gwei</w:t>
+      </w:r>
+    </w:p>
+    <w:p>
+      <w:pPr>
+        <w:spacing w:after="40" w:before="40"/>
+        <w:ind w:left="360"/>
+      </w:pPr>
+      <w:r>
+        <w:rPr>
+          <w:rFonts w:ascii="Courier New" w:cs="Courier New" w:eastAsia="Courier New" w:hAnsi="Courier New"/>
+          <w:color w:val="2C3E6B"/>
+          <w:sz w:val="18"/>
+          <w:szCs w:val="18"/>
+        </w:rPr>
+        <w:t xml:space="preserve">FROM ethereum.transactions</w:t>
+      </w:r>
+    </w:p>
+    <w:p>
+      <w:pPr>
+        <w:spacing w:after="40" w:before="40"/>
+        <w:ind w:left="360"/>
+      </w:pPr>
+      <w:r>
+        <w:rPr>
+          <w:rFonts w:ascii="Courier New" w:cs="Courier New" w:eastAsia="Courier New" w:hAnsi="Courier New"/>
+          <w:color w:val="2C3E6B"/>
+          <w:sz w:val="18"/>
+          <w:szCs w:val="18"/>
+        </w:rPr>
+        <w:t xml:space="preserve">ORDER BY block_time DESC</w:t>
+      </w:r>
+    </w:p>
+    <w:p>
+      <w:pPr>
+        <w:spacing w:after="40" w:before="40"/>
+        <w:ind w:left="360"/>
+      </w:pPr>
+      <w:r>
+        <w:rPr>
+          <w:rFonts w:ascii="Courier New" w:cs="Courier New" w:eastAsia="Courier New" w:hAnsi="Courier New"/>
+          <w:color w:val="2C3E6B"/>
+          <w:sz w:val="18"/>
+          <w:szCs w:val="18"/>
+        </w:rPr>
+        <w:t xml:space="preserve">LIMIT 10</w:t>
+      </w:r>
+    </w:p>
+    <w:p>
+      <w:pPr>
+        <w:spacing w:after="80" w:before="80"/>
+      </w:pPr>
+      <w:r>
+        <w:t xml:space="preserve"/>
+      </w:r>
+    </w:p>
+    <w:p>
+      <w:pPr>
+        <w:spacing w:after="60" w:before="60"/>
+      </w:pPr>
+      <w:r>
+        <w:rPr>
+          <w:rFonts w:ascii="Arial" w:cs="Arial" w:eastAsia="Arial" w:hAnsi="Arial"/>
+          <w:color w:val="222222"/>
+          <w:sz w:val="20"/>
+          <w:szCs w:val="20"/>
+        </w:rPr>
+        <w:t xml:space="preserve">Example 2: Daily transaction count with average gas price (also Query 2 in Section 4):</w:t>
+      </w:r>
+    </w:p>
+    <w:p>
+      <w:pPr>
+        <w:spacing w:after="80" w:before="80"/>
+      </w:pPr>
+      <w:r>
+        <w:t xml:space="preserve"/>
+      </w:r>
+    </w:p>
+    <w:p>
+      <w:pPr>
+        <w:spacing w:after="40" w:before="40"/>
+        <w:ind w:left="360"/>
+      </w:pPr>
+      <w:r>
+        <w:rPr>
+          <w:rFonts w:ascii="Courier New" w:cs="Courier New" w:eastAsia="Courier New" w:hAnsi="Courier New"/>
+          <w:color w:val="2C3E6B"/>
+          <w:sz w:val="18"/>
+          <w:szCs w:val="18"/>
+        </w:rPr>
+        <w:t xml:space="preserve">SELECT</w:t>
+      </w:r>
+    </w:p>
+    <w:p>
+      <w:pPr>
+        <w:spacing w:after="40" w:before="40"/>
+        <w:ind w:left="360"/>
+      </w:pPr>
+      <w:r>
+        <w:rPr>
+          <w:rFonts w:ascii="Courier New" w:cs="Courier New" w:eastAsia="Courier New" w:hAnsi="Courier New"/>
+          <w:color w:val="2C3E6B"/>
+          <w:sz w:val="18"/>
+          <w:szCs w:val="18"/>
+        </w:rPr>
+        <w:t xml:space="preserve">    DATE_TRUNC('day', block_time) AS date,</w:t>
+      </w:r>
+    </w:p>
+    <w:p>
+      <w:pPr>
+        <w:spacing w:after="40" w:before="40"/>
+        <w:ind w:left="360"/>
+      </w:pPr>
+      <w:r>
+        <w:rPr>
+          <w:rFonts w:ascii="Courier New" w:cs="Courier New" w:eastAsia="Courier New" w:hAnsi="Courier New"/>
+          <w:color w:val="2C3E6B"/>
+          <w:sz w:val="18"/>
+          <w:szCs w:val="18"/>
+        </w:rPr>
+        <w:t xml:space="preserve">    COUNT(*) AS transaction_count,</w:t>
+      </w:r>
+    </w:p>
+    <w:p>
+      <w:pPr>
+        <w:spacing w:after="40" w:before="40"/>
+        <w:ind w:left="360"/>
+      </w:pPr>
+      <w:r>
+        <w:rPr>
+          <w:rFonts w:ascii="Courier New" w:cs="Courier New" w:eastAsia="Courier New" w:hAnsi="Courier New"/>
+          <w:color w:val="2C3E6B"/>
+          <w:sz w:val="18"/>
+          <w:szCs w:val="18"/>
+        </w:rPr>
+        <w:t xml:space="preserve">    AVG(gas_price / 1e9) AS avg_gas_price_gwei</w:t>
+      </w:r>
+    </w:p>
+    <w:p>
+      <w:pPr>
+        <w:spacing w:after="40" w:before="40"/>
+        <w:ind w:left="360"/>
+      </w:pPr>
+      <w:r>
+        <w:rPr>
+          <w:rFonts w:ascii="Courier New" w:cs="Courier New" w:eastAsia="Courier New" w:hAnsi="Courier New"/>
+          <w:color w:val="2C3E6B"/>
+          <w:sz w:val="18"/>
+          <w:szCs w:val="18"/>
+        </w:rPr>
+        <w:t xml:space="preserve">FROM ethereum.transactions</w:t>
+      </w:r>
+    </w:p>
+    <w:p>
+      <w:pPr>
+        <w:spacing w:after="40" w:before="40"/>
+        <w:ind w:left="360"/>
+      </w:pPr>
+      <w:r>
+        <w:rPr>
+          <w:rFonts w:ascii="Courier New" w:cs="Courier New" w:eastAsia="Courier New" w:hAnsi="Courier New"/>
+          <w:color w:val="2C3E6B"/>
+          <w:sz w:val="18"/>
+          <w:szCs w:val="18"/>
+        </w:rPr>
+        <w:t xml:space="preserve">WHERE block_time &gt;= NOW() - INTERVAL '90' DAY</w:t>
+      </w:r>
+    </w:p>
+    <w:p>
+      <w:pPr>
+        <w:spacing w:after="40" w:before="40"/>
+        <w:ind w:left="360"/>
+      </w:pPr>
+      <w:r>
+        <w:rPr>
+          <w:rFonts w:ascii="Courier New" w:cs="Courier New" w:eastAsia="Courier New" w:hAnsi="Courier New"/>
+          <w:color w:val="2C3E6B"/>
+          <w:sz w:val="18"/>
+          <w:szCs w:val="18"/>
+        </w:rPr>
+        <w:t xml:space="preserve">GROUP BY 1</w:t>
+      </w:r>
+    </w:p>
+    <w:p>
+      <w:pPr>
+        <w:spacing w:after="40" w:before="40"/>
+        <w:ind w:left="360"/>
+      </w:pPr>
+      <w:r>
+        <w:rPr>
+          <w:rFonts w:ascii="Courier New" w:cs="Courier New" w:eastAsia="Courier New" w:hAnsi="Courier New"/>
+          <w:color w:val="2C3E6B"/>
+          <w:sz w:val="18"/>
+          <w:szCs w:val="18"/>
+        </w:rPr>
+        <w:t xml:space="preserve">ORDER BY 1</w:t>
       </w:r>
     </w:p>
     <w:p>
@@ -4772,7 +5041,7 @@
           <w:sz w:val="18"/>
           <w:szCs w:val="18"/>
         </w:rPr>
-        <w:t xml:space="preserve">    "from",</w:t>
+        <w:t xml:space="preserve">    'from',</w:t>
       </w:r>
     </w:p>
     <w:p>
@@ -6608,7 +6877,7 @@
         </w:rPr>
         <w:t xml:space="preserve">Ethereum: A next-generation smart contract and decentralized application platform. Ethereum Foundation. Available at: </w:t>
       </w:r>
-      <w:hyperlink w:history="1" r:id="rId3jai8phgjadvogi7qfeal">
+      <w:hyperlink w:history="1" r:id="rId74gy0alflxzn_dfhvdalz">
         <w:r>
           <w:rPr>
             <w:rFonts w:ascii="Arial" w:cs="Arial" w:eastAsia="Arial" w:hAnsi="Arial"/>
@@ -6646,7 +6915,7 @@
         </w:rPr>
         <w:t xml:space="preserve">Crypto market manipulation 2025: Suspected wash trading and pump-and-dump schemes. Chainalysis Research. Available at: </w:t>
       </w:r>
-      <w:hyperlink w:history="1" r:id="rIdhdi4hwqc-dx48zfjmlxub">
+      <w:hyperlink w:history="1" r:id="rIdh4ejcmrkbmfdkqbnrrfjg">
         <w:r>
           <w:rPr>
             <w:rFonts w:ascii="Arial" w:cs="Arial" w:eastAsia="Arial" w:hAnsi="Arial"/>
@@ -6684,7 +6953,7 @@
         </w:rPr>
         <w:t xml:space="preserve">USDC documentation. Circle Developer Portal. Available at: </w:t>
       </w:r>
-      <w:hyperlink w:history="1" r:id="rIdnoapa0mrsnrejdh2go1ww">
+      <w:hyperlink w:history="1" r:id="rIdabffgoolyr3jtdw26xfd6">
         <w:r>
           <w:rPr>
             <w:rFonts w:ascii="Arial" w:cs="Arial" w:eastAsia="Arial" w:hAnsi="Arial"/>
@@ -6722,7 +6991,7 @@
         </w:rPr>
         <w:t xml:space="preserve">Dune documentation: Getting started with on-chain data analysis. Available at: </w:t>
       </w:r>
-      <w:hyperlink w:history="1" r:id="rId-5ryx78vagbs5flnb16jm">
+      <w:hyperlink w:history="1" r:id="rIdgcbiwvy5a5kqurxeexpn_">
         <w:r>
           <w:rPr>
             <w:rFonts w:ascii="Arial" w:cs="Arial" w:eastAsia="Arial" w:hAnsi="Arial"/>
@@ -6760,7 +7029,7 @@
         </w:rPr>
         <w:t xml:space="preserve">Ethereum developer documentation: Transactions, gas, and Layer 2. Available at: </w:t>
       </w:r>
-      <w:hyperlink w:history="1" r:id="rId2nrzq_hrp-wmljbpl7tun">
+      <w:hyperlink w:history="1" r:id="rId9x7hzf5fdiij-vpsbhs7u">
         <w:r>
           <w:rPr>
             <w:rFonts w:ascii="Arial" w:cs="Arial" w:eastAsia="Arial" w:hAnsi="Arial"/>
@@ -6798,7 +7067,7 @@
         </w:rPr>
         <w:t xml:space="preserve">The Maker Protocol: MakerDAO’s multi-collateral DAI system. Available at: </w:t>
       </w:r>
-      <w:hyperlink w:history="1" r:id="rId5ikzadbaxvhqcqslceqib">
+      <w:hyperlink w:history="1" r:id="rIdjewxhoo0ndhqgsd-c3w-q">
         <w:r>
           <w:rPr>
             <w:rFonts w:ascii="Arial" w:cs="Arial" w:eastAsia="Arial" w:hAnsi="Arial"/>
@@ -6836,7 +7105,7 @@
         </w:rPr>
         <w:t xml:space="preserve">Bitcoin: A peer-to-peer electronic cash system. Available at: </w:t>
       </w:r>
-      <w:hyperlink w:history="1" r:id="rIdrgc4pj2vnifvccnuield7">
+      <w:hyperlink w:history="1" r:id="rIdp4u6r6h9zo59kdqxnqwki">
         <w:r>
           <w:rPr>
             <w:rFonts w:ascii="Arial" w:cs="Arial" w:eastAsia="Arial" w:hAnsi="Arial"/>
@@ -6900,7 +7169,7 @@
         </w:rPr>
         <w:t xml:space="preserve">The Bitcoin Lightning Network: Scalable off-chain instant payments. Available at: </w:t>
       </w:r>
-      <w:hyperlink w:history="1" r:id="rIdutr1_12nm_zcnz1svgo0_">
+      <w:hyperlink w:history="1" r:id="rIdb5uyszpk3t4zcgwq1zdgb">
         <w:r>
           <w:rPr>
             <w:rFonts w:ascii="Arial" w:cs="Arial" w:eastAsia="Arial" w:hAnsi="Arial"/>

</xml_diff>

<commit_message>
Add Query 6 results - Arbitrum overtakes Ethereum mainnet
</commit_message>
<xml_diff>
--- a/stage 2/Blockchain_Payments_Stage2.docx
+++ b/stage 2/Blockchain_Payments_Stage2.docx
@@ -145,7 +145,7 @@
         </w:rPr>
         <w:t xml:space="preserve">GitHub:  </w:t>
       </w:r>
-      <w:hyperlink w:history="1" r:id="rIdtk1luhem1dlw9hotv-r4t">
+      <w:hyperlink w:history="1" r:id="rIdzjrckkvuadanuul7ohn8q">
         <w:r>
           <w:rPr>
             <w:rFonts w:ascii="Arial" w:cs="Arial" w:eastAsia="Arial" w:hAnsi="Arial"/>
@@ -5607,6 +5607,262 @@
           <w:sz w:val="22"/>
           <w:szCs w:val="22"/>
         </w:rPr>
+        <w:t xml:space="preserve">What Query 6 Results Tell You</w:t>
+      </w:r>
+    </w:p>
+    <w:p>
+      <w:pPr>
+        <w:spacing w:after="60" w:before="60"/>
+      </w:pPr>
+      <w:r>
+        <w:rPr>
+          <w:rFonts w:ascii="Arial" w:cs="Arial" w:eastAsia="Arial" w:hAnsi="Arial"/>
+          <w:color w:val="222222"/>
+          <w:sz w:val="20"/>
+          <w:szCs w:val="20"/>
+        </w:rPr>
+        <w:t xml:space="preserve">When run in April 2026, the results were unambiguous:</w:t>
+      </w:r>
+    </w:p>
+    <w:p>
+      <w:pPr>
+        <w:spacing w:after="80" w:before="80"/>
+      </w:pPr>
+      <w:r>
+        <w:t xml:space="preserve"/>
+      </w:r>
+    </w:p>
+    <w:p>
+      <w:pPr>
+        <w:spacing w:after="60" w:before="60"/>
+        <w:ind w:left="360"/>
+      </w:pPr>
+      <w:r>
+        <w:rPr>
+          <w:rFonts w:ascii="Arial" w:cs="Arial" w:eastAsia="Arial" w:hAnsi="Arial"/>
+          <w:color w:val="1A7A8A"/>
+          <w:sz w:val="20"/>
+          <w:szCs w:val="20"/>
+        </w:rPr>
+        <w:t xml:space="preserve">◆  </w:t>
+      </w:r>
+      <w:r>
+        <w:rPr>
+          <w:rFonts w:ascii="Arial" w:cs="Arial" w:eastAsia="Arial" w:hAnsi="Arial"/>
+          <w:b/>
+          <w:bCs/>
+          <w:color w:val="222222"/>
+          <w:sz w:val="20"/>
+          <w:szCs w:val="20"/>
+        </w:rPr>
+        <w:t xml:space="preserve">Ethereum mainnet USDC transfers (30 days)</w:t>
+      </w:r>
+      <w:r>
+        <w:rPr>
+          <w:rFonts w:ascii="Arial" w:cs="Arial" w:eastAsia="Arial" w:hAnsi="Arial"/>
+          <w:color w:val="222222"/>
+          <w:sz w:val="20"/>
+          <w:szCs w:val="20"/>
+        </w:rPr>
+        <w:t xml:space="preserve">: 17,726,135</w:t>
+      </w:r>
+    </w:p>
+    <w:p>
+      <w:pPr>
+        <w:spacing w:after="60" w:before="60"/>
+        <w:ind w:left="360"/>
+      </w:pPr>
+      <w:r>
+        <w:rPr>
+          <w:rFonts w:ascii="Arial" w:cs="Arial" w:eastAsia="Arial" w:hAnsi="Arial"/>
+          <w:color w:val="1A7A8A"/>
+          <w:sz w:val="20"/>
+          <w:szCs w:val="20"/>
+        </w:rPr>
+        <w:t xml:space="preserve">◆  </w:t>
+      </w:r>
+      <w:r>
+        <w:rPr>
+          <w:rFonts w:ascii="Arial" w:cs="Arial" w:eastAsia="Arial" w:hAnsi="Arial"/>
+          <w:b/>
+          <w:bCs/>
+          <w:color w:val="222222"/>
+          <w:sz w:val="20"/>
+          <w:szCs w:val="20"/>
+        </w:rPr>
+        <w:t xml:space="preserve">Arbitrum USDC transfers (30 days)</w:t>
+      </w:r>
+      <w:r>
+        <w:rPr>
+          <w:rFonts w:ascii="Arial" w:cs="Arial" w:eastAsia="Arial" w:hAnsi="Arial"/>
+          <w:color w:val="222222"/>
+          <w:sz w:val="20"/>
+          <w:szCs w:val="20"/>
+        </w:rPr>
+        <w:t xml:space="preserve">: 25,243,032</w:t>
+      </w:r>
+    </w:p>
+    <w:p>
+      <w:pPr>
+        <w:spacing w:after="80" w:before="80"/>
+      </w:pPr>
+      <w:r>
+        <w:t xml:space="preserve"/>
+      </w:r>
+    </w:p>
+    <w:p>
+      <w:pPr>
+        <w:spacing w:after="60" w:before="60"/>
+      </w:pPr>
+      <w:r>
+        <w:rPr>
+          <w:rFonts w:ascii="Arial" w:cs="Arial" w:eastAsia="Arial" w:hAnsi="Arial"/>
+          <w:color w:val="222222"/>
+          <w:sz w:val="20"/>
+          <w:szCs w:val="20"/>
+        </w:rPr>
+        <w:t xml:space="preserve">Arbitrum processed 42% more USDC transfers than Ethereum mainnet in the same 30-day period. Layer 2 has not merely caught up to mainnet — it has overtaken it. The migration that was theoretical in Stage 1 is now a measured fact.</w:t>
+      </w:r>
+    </w:p>
+    <w:p>
+      <w:pPr>
+        <w:spacing w:after="80" w:before="80"/>
+      </w:pPr>
+      <w:r>
+        <w:t xml:space="preserve"/>
+      </w:r>
+    </w:p>
+    <w:p>
+      <w:pPr>
+        <w:spacing w:after="60" w:before="60"/>
+      </w:pPr>
+      <w:r>
+        <w:rPr>
+          <w:rFonts w:ascii="Arial" w:cs="Arial" w:eastAsia="Arial" w:hAnsi="Arial"/>
+          <w:color w:val="222222"/>
+          <w:sz w:val="20"/>
+          <w:szCs w:val="20"/>
+        </w:rPr>
+        <w:t xml:space="preserve">The economic interpretation is straightforward. Arbitrum offers the same USDC, the same security guarantees ultimately derived from Ethereum, but at 10 to 50 times lower fees. Users voted with their transactions. The market chose the cheaper option — exactly as economic theory predicts when two close substitutes exist at different price points. This is the scarce resource allocation problem resolving itself through the price mechanism: when Ethereum mainnet became too expensive for everyday payments, demand migrated to the lower-cost Layer 2 alternative.</w:t>
+      </w:r>
+    </w:p>
+    <w:p>
+      <w:pPr>
+        <w:spacing w:after="80" w:before="80"/>
+      </w:pPr>
+      <w:r>
+        <w:t xml:space="preserve"/>
+      </w:r>
+    </w:p>
+    <w:p>
+      <w:pPr>
+        <w:spacing w:after="60" w:before="60"/>
+      </w:pPr>
+      <w:r>
+        <w:rPr>
+          <w:rFonts w:ascii="Arial" w:cs="Arial" w:eastAsia="Arial" w:hAnsi="Arial"/>
+          <w:color w:val="222222"/>
+          <w:sz w:val="20"/>
+          <w:szCs w:val="20"/>
+        </w:rPr>
+        <w:t xml:space="preserve">This finding also has a direct implication for on-chain analysis methodology. Any analyst who queries only Ethereum mainnet for USDC payment data is now looking at less than 41% of the actual transfer activity. A complete picture of crypto payment flows requires querying mainnet and all major Layer 2 networks simultaneously.</w:t>
+      </w:r>
+    </w:p>
+    <w:p>
+      <w:pPr>
+        <w:spacing w:after="80" w:before="80"/>
+      </w:pPr>
+      <w:r>
+        <w:t xml:space="preserve"/>
+      </w:r>
+    </w:p>
+    <w:tbl>
+      <w:tblPr>
+        <w:tblW w:type="dxa" w:w="9026"/>
+        <w:tblBorders>
+          <w:top w:val="single" w:color="auto" w:sz="4"/>
+          <w:left w:val="single" w:color="auto" w:sz="4"/>
+          <w:bottom w:val="single" w:color="auto" w:sz="4"/>
+          <w:right w:val="single" w:color="auto" w:sz="4"/>
+          <w:insideH w:val="single" w:color="auto" w:sz="4"/>
+          <w:insideV w:val="single" w:color="auto" w:sz="4"/>
+        </w:tblBorders>
+      </w:tblPr>
+      <w:tblGrid>
+        <w:gridCol w:w="9026"/>
+      </w:tblGrid>
+      <w:tr>
+        <w:tc>
+          <w:tcPr>
+            <w:tcBorders>
+              <w:top w:val="single" w:color="1A7A8A" w:sz="6"/>
+              <w:left w:val="single" w:color="1A7A8A" w:sz="24"/>
+              <w:bottom w:val="none" w:color="FFFFFF" w:sz="0"/>
+              <w:right w:val="none" w:color="FFFFFF" w:sz="0"/>
+            </w:tcBorders>
+            <w:shd w:fill="E8F4F8" w:val="clear"/>
+            <w:tcMar>
+              <w:top w:type="dxa" w:w="120"/>
+              <w:left w:type="dxa" w:w="200"/>
+              <w:bottom w:type="dxa" w:w="120"/>
+              <w:right w:type="dxa" w:w="200"/>
+            </w:tcMar>
+          </w:tcPr>
+          <w:p>
+            <w:pPr>
+              <w:spacing w:after="40" w:before="0"/>
+            </w:pPr>
+            <w:r>
+              <w:rPr>
+                <w:rFonts w:ascii="Arial" w:cs="Arial" w:eastAsia="Arial" w:hAnsi="Arial"/>
+                <w:b/>
+                <w:bCs/>
+                <w:caps/>
+                <w:color w:val="1A7A8A"/>
+                <w:sz w:val="18"/>
+                <w:szCs w:val="18"/>
+              </w:rPr>
+              <w:t xml:space="preserve">Methodological Note</w:t>
+            </w:r>
+          </w:p>
+          <w:p>
+            <w:pPr>
+              <w:spacing w:after="0" w:before="0"/>
+            </w:pPr>
+            <w:r>
+              <w:rPr>
+                <w:rFonts w:ascii="Arial" w:cs="Arial" w:eastAsia="Arial" w:hAnsi="Arial"/>
+                <w:color w:val="222222"/>
+                <w:sz w:val="18"/>
+                <w:szCs w:val="18"/>
+              </w:rPr>
+              <w:t xml:space="preserve">The USDC contract address is different on each chain — 0xa0b86991c6218b36c1d19d4a2e9eb0ce3606eb48 on Ethereum mainnet, 0xaf88d065e77c8cc2239327c5edb3a432268e5831 on Arbitrum. Always verify the correct contract address for each chain before running cross-chain comparisons. Using the wrong address will return zero results without an error — a silent mistake that could invalidate an entire analysis.</w:t>
+            </w:r>
+          </w:p>
+        </w:tc>
+      </w:tr>
+    </w:tbl>
+    <w:p>
+      <w:pPr>
+        <w:spacing w:after="80" w:before="80"/>
+      </w:pPr>
+      <w:r>
+        <w:t xml:space="preserve"/>
+      </w:r>
+    </w:p>
+    <w:p>
+      <w:pPr>
+        <w:spacing w:after="60" w:before="200"/>
+      </w:pPr>
+      <w:r>
+        <w:rPr>
+          <w:rFonts w:ascii="Arial" w:cs="Arial" w:eastAsia="Arial" w:hAnsi="Arial"/>
+          <w:b/>
+          <w:bCs/>
+          <w:color w:val="2C3E6B"/>
+          <w:sz w:val="22"/>
+          <w:szCs w:val="22"/>
+        </w:rPr>
         <w:t xml:space="preserve">Query 7: Large Payment Detection — Whale Transfers</w:t>
       </w:r>
     </w:p>
@@ -7510,7 +7766,7 @@
         </w:rPr>
         <w:t xml:space="preserve">Ethereum: A next-generation smart contract and decentralized application platform. Ethereum Foundation. Available at: </w:t>
       </w:r>
-      <w:hyperlink w:history="1" r:id="rId-t1rykk51cafmtmf0ugob">
+      <w:hyperlink w:history="1" r:id="rIdpcidqqhfpacq50cwod4-m">
         <w:r>
           <w:rPr>
             <w:rFonts w:ascii="Arial" w:cs="Arial" w:eastAsia="Arial" w:hAnsi="Arial"/>
@@ -7548,7 +7804,7 @@
         </w:rPr>
         <w:t xml:space="preserve">Crypto market manipulation 2025: Suspected wash trading and pump-and-dump schemes. Chainalysis Research. Available at: </w:t>
       </w:r>
-      <w:hyperlink w:history="1" r:id="rIdmj1dx4qhloa2chbggzg3c">
+      <w:hyperlink w:history="1" r:id="rIdvagdlqrvdd0hjpw_mhtx2">
         <w:r>
           <w:rPr>
             <w:rFonts w:ascii="Arial" w:cs="Arial" w:eastAsia="Arial" w:hAnsi="Arial"/>
@@ -7586,7 +7842,7 @@
         </w:rPr>
         <w:t xml:space="preserve">USDC documentation. Circle Developer Portal. Available at: </w:t>
       </w:r>
-      <w:hyperlink w:history="1" r:id="rIdn9nlbzinmcffe4xozy0gv">
+      <w:hyperlink w:history="1" r:id="rIdryd7mfqiy2odc2fbnyj9q">
         <w:r>
           <w:rPr>
             <w:rFonts w:ascii="Arial" w:cs="Arial" w:eastAsia="Arial" w:hAnsi="Arial"/>
@@ -7624,7 +7880,7 @@
         </w:rPr>
         <w:t xml:space="preserve">Dune documentation: Getting started with on-chain data analysis. Available at: </w:t>
       </w:r>
-      <w:hyperlink w:history="1" r:id="rIdjhsuz0wxpfs7r0mw61yuy">
+      <w:hyperlink w:history="1" r:id="rIdagfhwupipucc0kay_lui5">
         <w:r>
           <w:rPr>
             <w:rFonts w:ascii="Arial" w:cs="Arial" w:eastAsia="Arial" w:hAnsi="Arial"/>
@@ -7662,7 +7918,7 @@
         </w:rPr>
         <w:t xml:space="preserve">Ethereum developer documentation: Transactions, gas, and Layer 2. Available at: </w:t>
       </w:r>
-      <w:hyperlink w:history="1" r:id="rId0gakh8fzznuagrf4aw0f4">
+      <w:hyperlink w:history="1" r:id="rId8c8ynqcwr6i_s84hmtjeb">
         <w:r>
           <w:rPr>
             <w:rFonts w:ascii="Arial" w:cs="Arial" w:eastAsia="Arial" w:hAnsi="Arial"/>
@@ -7700,7 +7956,7 @@
         </w:rPr>
         <w:t xml:space="preserve">The Maker Protocol: MakerDAO’s multi-collateral DAI system. Available at: </w:t>
       </w:r>
-      <w:hyperlink w:history="1" r:id="rIdb0tw9spdksifze8bts5zl">
+      <w:hyperlink w:history="1" r:id="rIdwjfo5wysaaeoqlw-dqcsk">
         <w:r>
           <w:rPr>
             <w:rFonts w:ascii="Arial" w:cs="Arial" w:eastAsia="Arial" w:hAnsi="Arial"/>
@@ -7738,7 +7994,7 @@
         </w:rPr>
         <w:t xml:space="preserve">Bitcoin: A peer-to-peer electronic cash system. Available at: </w:t>
       </w:r>
-      <w:hyperlink w:history="1" r:id="rIdlot0kaercbnvvjc1hyzbd">
+      <w:hyperlink w:history="1" r:id="rIdsackhglru-bzsdnwxudim">
         <w:r>
           <w:rPr>
             <w:rFonts w:ascii="Arial" w:cs="Arial" w:eastAsia="Arial" w:hAnsi="Arial"/>
@@ -7802,7 +8058,7 @@
         </w:rPr>
         <w:t xml:space="preserve">The Bitcoin Lightning Network: Scalable off-chain instant payments. Available at: </w:t>
       </w:r>
-      <w:hyperlink w:history="1" r:id="rIdkhi3dsccwqrma9d3vaccl">
+      <w:hyperlink w:history="1" r:id="rIdonjpppurewwo9xhdwleyq">
         <w:r>
           <w:rPr>
             <w:rFonts w:ascii="Arial" w:cs="Arial" w:eastAsia="Arial" w:hAnsi="Arial"/>

</xml_diff>

<commit_message>
update on the progress
</commit_message>
<xml_diff>
--- a/stage 2/Blockchain_Payments_Stage2.docx
+++ b/stage 2/Blockchain_Payments_Stage2.docx
@@ -145,7 +145,7 @@
         </w:rPr>
         <w:t xml:space="preserve">GitHub:  </w:t>
       </w:r>
-      <w:hyperlink w:history="1" r:id="rIdzjrckkvuadanuul7ohn8q">
+      <w:hyperlink w:history="1" r:id="rIdjutyrnl2eeu5tawikfkl8">
         <w:r>
           <w:rPr>
             <w:rFonts w:ascii="Arial" w:cs="Arial" w:eastAsia="Arial" w:hAnsi="Arial"/>
@@ -6111,293 +6111,141 @@
           <w:sz w:val="22"/>
           <w:szCs w:val="22"/>
         </w:rPr>
-        <w:t xml:space="preserve">Query 8: Fee Efficiency Analysis — Cost Per Dollar Transferred</w:t>
-      </w:r>
-    </w:p>
-    <w:p>
-      <w:pPr>
-        <w:spacing w:after="60" w:before="60"/>
-      </w:pPr>
-      <w:r>
-        <w:rPr>
-          <w:rFonts w:ascii="Arial" w:cs="Arial" w:eastAsia="Arial" w:hAnsi="Arial"/>
-          <w:color w:val="222222"/>
-          <w:sz w:val="20"/>
-          <w:szCs w:val="20"/>
-        </w:rPr>
-        <w:t xml:space="preserve">This query calculates the fee paid as a percentage of value transferred for ETH transactions. It measures economic efficiency — how much of each transfer is consumed by network fees. This is directly relevant to the payment viability question: at what transaction size does Ethereum mainnet become economically irrational for payments?</w:t>
-      </w:r>
-    </w:p>
-    <w:p>
-      <w:pPr>
-        <w:spacing w:after="80" w:before="80"/>
-      </w:pPr>
-      <w:r>
-        <w:t xml:space="preserve"/>
-      </w:r>
-    </w:p>
-    <w:p>
-      <w:pPr>
-        <w:spacing w:after="40" w:before="40"/>
-        <w:ind w:left="360"/>
-      </w:pPr>
-      <w:r>
-        <w:rPr>
-          <w:rFonts w:ascii="Courier New" w:cs="Courier New" w:eastAsia="Courier New" w:hAnsi="Courier New"/>
-          <w:color w:val="2C3E6B"/>
-          <w:sz w:val="18"/>
-          <w:szCs w:val="18"/>
-        </w:rPr>
-        <w:t xml:space="preserve">SELECT</w:t>
-      </w:r>
-    </w:p>
-    <w:p>
-      <w:pPr>
-        <w:spacing w:after="40" w:before="40"/>
-        <w:ind w:left="360"/>
-      </w:pPr>
-      <w:r>
-        <w:rPr>
-          <w:rFonts w:ascii="Courier New" w:cs="Courier New" w:eastAsia="Courier New" w:hAnsi="Courier New"/>
-          <w:color w:val="2C3E6B"/>
-          <w:sz w:val="18"/>
-          <w:szCs w:val="18"/>
-        </w:rPr>
-        <w:t xml:space="preserve">    CASE</w:t>
-      </w:r>
-    </w:p>
-    <w:p>
-      <w:pPr>
-        <w:spacing w:after="40" w:before="40"/>
-        <w:ind w:left="360"/>
-      </w:pPr>
-      <w:r>
-        <w:rPr>
-          <w:rFonts w:ascii="Courier New" w:cs="Courier New" w:eastAsia="Courier New" w:hAnsi="Courier New"/>
-          <w:color w:val="2C3E6B"/>
-          <w:sz w:val="18"/>
-          <w:szCs w:val="18"/>
-        </w:rPr>
-        <w:t xml:space="preserve">        WHEN value / 1e18 &lt; 0.01 THEN 'Micro (&lt;0.01 ETH)'</w:t>
-      </w:r>
-    </w:p>
-    <w:p>
-      <w:pPr>
-        <w:spacing w:after="40" w:before="40"/>
-        <w:ind w:left="360"/>
-      </w:pPr>
-      <w:r>
-        <w:rPr>
-          <w:rFonts w:ascii="Courier New" w:cs="Courier New" w:eastAsia="Courier New" w:hAnsi="Courier New"/>
-          <w:color w:val="2C3E6B"/>
-          <w:sz w:val="18"/>
-          <w:szCs w:val="18"/>
-        </w:rPr>
-        <w:t xml:space="preserve">        WHEN value / 1e18 &lt; 0.1 THEN 'Small (0.01-0.1 ETH)'</w:t>
-      </w:r>
-    </w:p>
-    <w:p>
-      <w:pPr>
-        <w:spacing w:after="40" w:before="40"/>
-        <w:ind w:left="360"/>
-      </w:pPr>
-      <w:r>
-        <w:rPr>
-          <w:rFonts w:ascii="Courier New" w:cs="Courier New" w:eastAsia="Courier New" w:hAnsi="Courier New"/>
-          <w:color w:val="2C3E6B"/>
-          <w:sz w:val="18"/>
-          <w:szCs w:val="18"/>
-        </w:rPr>
-        <w:t xml:space="preserve">        WHEN value / 1e18 &lt; 1 THEN 'Medium (0.1-1 ETH)'</w:t>
-      </w:r>
-    </w:p>
-    <w:p>
-      <w:pPr>
-        <w:spacing w:after="40" w:before="40"/>
-        <w:ind w:left="360"/>
-      </w:pPr>
-      <w:r>
-        <w:rPr>
-          <w:rFonts w:ascii="Courier New" w:cs="Courier New" w:eastAsia="Courier New" w:hAnsi="Courier New"/>
-          <w:color w:val="2C3E6B"/>
-          <w:sz w:val="18"/>
-          <w:szCs w:val="18"/>
-        </w:rPr>
-        <w:t xml:space="preserve">        WHEN value / 1e18 &lt; 10 THEN 'Large (1-10 ETH)'</w:t>
-      </w:r>
-    </w:p>
-    <w:p>
-      <w:pPr>
-        <w:spacing w:after="40" w:before="40"/>
-        <w:ind w:left="360"/>
-      </w:pPr>
-      <w:r>
-        <w:rPr>
-          <w:rFonts w:ascii="Courier New" w:cs="Courier New" w:eastAsia="Courier New" w:hAnsi="Courier New"/>
-          <w:color w:val="2C3E6B"/>
-          <w:sz w:val="18"/>
-          <w:szCs w:val="18"/>
-        </w:rPr>
-        <w:t xml:space="preserve">        ELSE 'Whale (&gt;10 ETH)'</w:t>
-      </w:r>
-    </w:p>
-    <w:p>
-      <w:pPr>
-        <w:spacing w:after="40" w:before="40"/>
-        <w:ind w:left="360"/>
-      </w:pPr>
-      <w:r>
-        <w:rPr>
-          <w:rFonts w:ascii="Courier New" w:cs="Courier New" w:eastAsia="Courier New" w:hAnsi="Courier New"/>
-          <w:color w:val="2C3E6B"/>
-          <w:sz w:val="18"/>
-          <w:szCs w:val="18"/>
-        </w:rPr>
-        <w:t xml:space="preserve">    END AS transaction_size,</w:t>
-      </w:r>
-    </w:p>
-    <w:p>
-      <w:pPr>
-        <w:spacing w:after="40" w:before="40"/>
-        <w:ind w:left="360"/>
-      </w:pPr>
-      <w:r>
-        <w:rPr>
-          <w:rFonts w:ascii="Courier New" w:cs="Courier New" w:eastAsia="Courier New" w:hAnsi="Courier New"/>
-          <w:color w:val="2C3E6B"/>
-          <w:sz w:val="18"/>
-          <w:szCs w:val="18"/>
-        </w:rPr>
-        <w:t xml:space="preserve">    COUNT(*) AS count,</w:t>
-      </w:r>
-    </w:p>
-    <w:p>
-      <w:pPr>
-        <w:spacing w:after="40" w:before="40"/>
-        <w:ind w:left="360"/>
-      </w:pPr>
-      <w:r>
-        <w:rPr>
-          <w:rFonts w:ascii="Courier New" w:cs="Courier New" w:eastAsia="Courier New" w:hAnsi="Courier New"/>
-          <w:color w:val="2C3E6B"/>
-          <w:sz w:val="18"/>
-          <w:szCs w:val="18"/>
-        </w:rPr>
-        <w:t xml:space="preserve">    AVG((gas_used * gas_price / 1e18) / NULLIF(value / 1e18, 0) * 100) AS avg_fee_pct</w:t>
-      </w:r>
-    </w:p>
-    <w:p>
-      <w:pPr>
-        <w:spacing w:after="40" w:before="40"/>
-        <w:ind w:left="360"/>
-      </w:pPr>
-      <w:r>
-        <w:rPr>
-          <w:rFonts w:ascii="Courier New" w:cs="Courier New" w:eastAsia="Courier New" w:hAnsi="Courier New"/>
-          <w:color w:val="2C3E6B"/>
-          <w:sz w:val="18"/>
-          <w:szCs w:val="18"/>
-        </w:rPr>
-        <w:t xml:space="preserve">FROM ethereum.transactions</w:t>
-      </w:r>
-    </w:p>
-    <w:p>
-      <w:pPr>
-        <w:spacing w:after="40" w:before="40"/>
-        <w:ind w:left="360"/>
-      </w:pPr>
-      <w:r>
-        <w:rPr>
-          <w:rFonts w:ascii="Courier New" w:cs="Courier New" w:eastAsia="Courier New" w:hAnsi="Courier New"/>
-          <w:color w:val="2C3E6B"/>
-          <w:sz w:val="18"/>
-          <w:szCs w:val="18"/>
-        </w:rPr>
-        <w:t xml:space="preserve">WHERE block_time &gt;= NOW() - INTERVAL '7' DAY</w:t>
-      </w:r>
-    </w:p>
-    <w:p>
-      <w:pPr>
-        <w:spacing w:after="40" w:before="40"/>
-        <w:ind w:left="360"/>
-      </w:pPr>
-      <w:r>
-        <w:rPr>
-          <w:rFonts w:ascii="Courier New" w:cs="Courier New" w:eastAsia="Courier New" w:hAnsi="Courier New"/>
-          <w:color w:val="2C3E6B"/>
-          <w:sz w:val="18"/>
-          <w:szCs w:val="18"/>
-        </w:rPr>
-        <w:t xml:space="preserve">    AND value &gt; 0</w:t>
-      </w:r>
-    </w:p>
-    <w:p>
-      <w:pPr>
-        <w:spacing w:after="40" w:before="40"/>
-        <w:ind w:left="360"/>
-      </w:pPr>
-      <w:r>
-        <w:rPr>
-          <w:rFonts w:ascii="Courier New" w:cs="Courier New" w:eastAsia="Courier New" w:hAnsi="Courier New"/>
-          <w:color w:val="2C3E6B"/>
-          <w:sz w:val="18"/>
-          <w:szCs w:val="18"/>
-        </w:rPr>
-        <w:t xml:space="preserve">    AND success = TRUE</w:t>
-      </w:r>
-    </w:p>
-    <w:p>
-      <w:pPr>
-        <w:spacing w:after="40" w:before="40"/>
-        <w:ind w:left="360"/>
-      </w:pPr>
-      <w:r>
-        <w:rPr>
-          <w:rFonts w:ascii="Courier New" w:cs="Courier New" w:eastAsia="Courier New" w:hAnsi="Courier New"/>
-          <w:color w:val="2C3E6B"/>
-          <w:sz w:val="18"/>
-          <w:szCs w:val="18"/>
-        </w:rPr>
-        <w:t xml:space="preserve">GROUP BY 1</w:t>
-      </w:r>
-    </w:p>
-    <w:p>
-      <w:pPr>
-        <w:spacing w:after="40" w:before="40"/>
-        <w:ind w:left="360"/>
-      </w:pPr>
-      <w:r>
-        <w:rPr>
-          <w:rFonts w:ascii="Courier New" w:cs="Courier New" w:eastAsia="Courier New" w:hAnsi="Courier New"/>
-          <w:color w:val="2C3E6B"/>
-          <w:sz w:val="18"/>
-          <w:szCs w:val="18"/>
-        </w:rPr>
-        <w:t xml:space="preserve">ORDER BY 2 DESC</w:t>
-      </w:r>
-    </w:p>
-    <w:p>
-      <w:pPr>
-        <w:spacing w:after="80" w:before="80"/>
-      </w:pPr>
-      <w:r>
-        <w:t xml:space="preserve"/>
-      </w:r>
-    </w:p>
-    <w:p>
-      <w:pPr>
-        <w:spacing w:after="60" w:before="60"/>
-      </w:pPr>
-      <w:r>
-        <w:rPr>
-          <w:rFonts w:ascii="Arial" w:cs="Arial" w:eastAsia="Arial" w:hAnsi="Arial"/>
-          <w:color w:val="222222"/>
-          <w:sz w:val="20"/>
-          <w:szCs w:val="20"/>
-        </w:rPr>
-        <w:t xml:space="preserve">The result will show that small transactions pay a disproportionately high percentage of their value in fees. This is the economic argument for Layer 2 payments made visible in real data.</w:t>
-      </w:r>
-    </w:p>
+        <w:t xml:space="preserve">What Query 7 Results Tell You</w:t>
+      </w:r>
+    </w:p>
+    <w:p>
+      <w:pPr>
+        <w:spacing w:after="60" w:before="60"/>
+      </w:pPr>
+      <w:r>
+        <w:rPr>
+          <w:rFonts w:ascii="Arial" w:cs="Arial" w:eastAsia="Arial" w:hAnsi="Arial"/>
+          <w:color w:val="222222"/>
+          <w:sz w:val="20"/>
+          <w:szCs w:val="20"/>
+        </w:rPr>
+        <w:t xml:space="preserve">When run in April 2026, the largest single USDC transfer in the 30-day period was 503,029,764 USDC — approximately USD 503 million in a single transaction. Following the transaction hash to Etherscan revealed something analytically critical: the transfer was from Binance wallet 14 to Binance Hot Wallet 34. Both addresses belong to the same entity — Binance, the cryptocurrency exchange. This was not a payment between two different parties. It was an internal fund reorganization.</w:t>
+      </w:r>
+    </w:p>
+    <w:p>
+      <w:pPr>
+        <w:spacing w:after="80" w:before="80"/>
+      </w:pPr>
+      <w:r>
+        <w:t xml:space="preserve"/>
+      </w:r>
+    </w:p>
+    <w:p>
+      <w:pPr>
+        <w:spacing w:after="60" w:before="60"/>
+      </w:pPr>
+      <w:r>
+        <w:rPr>
+          <w:rFonts w:ascii="Arial" w:cs="Arial" w:eastAsia="Arial" w:hAnsi="Arial"/>
+          <w:color w:val="222222"/>
+          <w:sz w:val="20"/>
+          <w:szCs w:val="20"/>
+        </w:rPr>
+        <w:t xml:space="preserve">This finding directly illustrates the adjusted transaction volume concept established in Stage 1. A naive analyst counting this as a USD 503 million payment would be wrong. It is internal plumbing — Binance moving money between its own wallets. Identifying and filtering out such transfers is essential for accurate payment flow analysis.</w:t>
+      </w:r>
+    </w:p>
+    <w:p>
+      <w:pPr>
+        <w:spacing w:after="80" w:before="80"/>
+      </w:pPr>
+      <w:r>
+        <w:t xml:space="preserve"/>
+      </w:r>
+    </w:p>
+    <w:p>
+      <w:pPr>
+        <w:spacing w:after="60" w:before="60"/>
+      </w:pPr>
+      <w:r>
+        <w:rPr>
+          <w:rFonts w:ascii="Arial" w:cs="Arial" w:eastAsia="Arial" w:hAnsi="Arial"/>
+          <w:color w:val="222222"/>
+          <w:sz w:val="20"/>
+          <w:szCs w:val="20"/>
+        </w:rPr>
+        <w:t xml:space="preserve">Additional observations from the results: several transfers of exactly 430,000,000 USDC appeared on April 6, 2026 — four transfers of the exact same amount within minutes of each other. Identical round-number transfers in rapid succession are a classic signature of automated institutional settlement systems, not organic payment activity. These are worth investigating further.</w:t>
+      </w:r>
+    </w:p>
+    <w:p>
+      <w:pPr>
+        <w:spacing w:after="80" w:before="80"/>
+      </w:pPr>
+      <w:r>
+        <w:t xml:space="preserve"/>
+      </w:r>
+    </w:p>
+    <w:tbl>
+      <w:tblPr>
+        <w:tblW w:type="dxa" w:w="9026"/>
+        <w:tblBorders>
+          <w:top w:val="single" w:color="auto" w:sz="4"/>
+          <w:left w:val="single" w:color="auto" w:sz="4"/>
+          <w:bottom w:val="single" w:color="auto" w:sz="4"/>
+          <w:right w:val="single" w:color="auto" w:sz="4"/>
+          <w:insideH w:val="single" w:color="auto" w:sz="4"/>
+          <w:insideV w:val="single" w:color="auto" w:sz="4"/>
+        </w:tblBorders>
+      </w:tblPr>
+      <w:tblGrid>
+        <w:gridCol w:w="9026"/>
+      </w:tblGrid>
+      <w:tr>
+        <w:tc>
+          <w:tcPr>
+            <w:tcBorders>
+              <w:top w:val="single" w:color="1A7A8A" w:sz="6"/>
+              <w:left w:val="single" w:color="1A7A8A" w:sz="24"/>
+              <w:bottom w:val="none" w:color="FFFFFF" w:sz="0"/>
+              <w:right w:val="none" w:color="FFFFFF" w:sz="0"/>
+            </w:tcBorders>
+            <w:shd w:fill="E8F4F8" w:val="clear"/>
+            <w:tcMar>
+              <w:top w:type="dxa" w:w="120"/>
+              <w:left w:type="dxa" w:w="200"/>
+              <w:bottom w:type="dxa" w:w="120"/>
+              <w:right w:type="dxa" w:w="200"/>
+            </w:tcMar>
+          </w:tcPr>
+          <w:p>
+            <w:pPr>
+              <w:spacing w:after="40" w:before="0"/>
+            </w:pPr>
+            <w:r>
+              <w:rPr>
+                <w:rFonts w:ascii="Arial" w:cs="Arial" w:eastAsia="Arial" w:hAnsi="Arial"/>
+                <w:b/>
+                <w:bCs/>
+                <w:caps/>
+                <w:color w:val="1A7A8A"/>
+                <w:sz w:val="18"/>
+                <w:szCs w:val="18"/>
+              </w:rPr>
+              <w:t xml:space="preserve">Key Forensic Skill</w:t>
+            </w:r>
+          </w:p>
+          <w:p>
+            <w:pPr>
+              <w:spacing w:after="0" w:before="0"/>
+            </w:pPr>
+            <w:r>
+              <w:rPr>
+                <w:rFonts w:ascii="Arial" w:cs="Arial" w:eastAsia="Arial" w:hAnsi="Arial"/>
+                <w:color w:val="222222"/>
+                <w:sz w:val="18"/>
+                <w:szCs w:val="18"/>
+              </w:rPr>
+              <w:t xml:space="preserve">Whale transfer analysis always requires a second step: following the transaction hash to Etherscan to identify whether the transfer was between different economic actors or internal to one entity. The query finds the transactions. The forensic judgment determines what they mean.</w:t>
+            </w:r>
+          </w:p>
+        </w:tc>
+      </w:tr>
+    </w:tbl>
     <w:p>
       <w:pPr>
         <w:spacing w:after="80" w:before="80"/>
@@ -6419,21 +6267,21 @@
           <w:sz w:val="22"/>
           <w:szCs w:val="22"/>
         </w:rPr>
-        <w:t xml:space="preserve">Query 9: Payment Velocity — Transactions Per Hour</w:t>
-      </w:r>
-    </w:p>
-    <w:p>
-      <w:pPr>
-        <w:spacing w:after="60" w:before="60"/>
-      </w:pPr>
-      <w:r>
-        <w:rPr>
-          <w:rFonts w:ascii="Arial" w:cs="Arial" w:eastAsia="Arial" w:hAnsi="Arial"/>
-          <w:color w:val="222222"/>
-          <w:sz w:val="20"/>
-          <w:szCs w:val="20"/>
-        </w:rPr>
-        <w:t xml:space="preserve">This query measures transaction counts by hour of day, averaged across the last 30 days. It reveals the circadian rhythm of blockchain payment activity — when during the day are most payments processed? This connects to the geographic propagation analysis from Stage 1: peaks during US and European business hours would suggest Western market dominance.</w:t>
+        <w:t xml:space="preserve">Query 8: Fee Efficiency Analysis — Cost Per Dollar Transferred</w:t>
+      </w:r>
+    </w:p>
+    <w:p>
+      <w:pPr>
+        <w:spacing w:after="60" w:before="60"/>
+      </w:pPr>
+      <w:r>
+        <w:rPr>
+          <w:rFonts w:ascii="Arial" w:cs="Arial" w:eastAsia="Arial" w:hAnsi="Arial"/>
+          <w:color w:val="222222"/>
+          <w:sz w:val="20"/>
+          <w:szCs w:val="20"/>
+        </w:rPr>
+        <w:t xml:space="preserve">This query calculates the fee paid as a percentage of value transferred for ETH transactions. It measures economic efficiency — how much of each transfer is consumed by network fees. This is directly relevant to the payment viability question: at what transaction size does Ethereum mainnet become economically irrational for payments?</w:t>
       </w:r>
     </w:p>
     <w:p>
@@ -6471,22 +6319,127 @@
           <w:sz w:val="18"/>
           <w:szCs w:val="18"/>
         </w:rPr>
-        <w:t xml:space="preserve">    HOUR(block_time) AS hour_of_day,</w:t>
-      </w:r>
-    </w:p>
-    <w:p>
-      <w:pPr>
-        <w:spacing w:after="40" w:before="40"/>
-        <w:ind w:left="360"/>
-      </w:pPr>
-      <w:r>
-        <w:rPr>
-          <w:rFonts w:ascii="Courier New" w:cs="Courier New" w:eastAsia="Courier New" w:hAnsi="Courier New"/>
-          <w:color w:val="2C3E6B"/>
-          <w:sz w:val="18"/>
-          <w:szCs w:val="18"/>
-        </w:rPr>
-        <w:t xml:space="preserve">    COUNT(*) / 30.0 AS avg_daily_transactions</w:t>
+        <w:t xml:space="preserve">    CASE</w:t>
+      </w:r>
+    </w:p>
+    <w:p>
+      <w:pPr>
+        <w:spacing w:after="40" w:before="40"/>
+        <w:ind w:left="360"/>
+      </w:pPr>
+      <w:r>
+        <w:rPr>
+          <w:rFonts w:ascii="Courier New" w:cs="Courier New" w:eastAsia="Courier New" w:hAnsi="Courier New"/>
+          <w:color w:val="2C3E6B"/>
+          <w:sz w:val="18"/>
+          <w:szCs w:val="18"/>
+        </w:rPr>
+        <w:t xml:space="preserve">        WHEN value / 1e18 &lt; 0.01 THEN 'Micro (&lt;0.01 ETH)'</w:t>
+      </w:r>
+    </w:p>
+    <w:p>
+      <w:pPr>
+        <w:spacing w:after="40" w:before="40"/>
+        <w:ind w:left="360"/>
+      </w:pPr>
+      <w:r>
+        <w:rPr>
+          <w:rFonts w:ascii="Courier New" w:cs="Courier New" w:eastAsia="Courier New" w:hAnsi="Courier New"/>
+          <w:color w:val="2C3E6B"/>
+          <w:sz w:val="18"/>
+          <w:szCs w:val="18"/>
+        </w:rPr>
+        <w:t xml:space="preserve">        WHEN value / 1e18 &lt; 0.1 THEN 'Small (0.01-0.1 ETH)'</w:t>
+      </w:r>
+    </w:p>
+    <w:p>
+      <w:pPr>
+        <w:spacing w:after="40" w:before="40"/>
+        <w:ind w:left="360"/>
+      </w:pPr>
+      <w:r>
+        <w:rPr>
+          <w:rFonts w:ascii="Courier New" w:cs="Courier New" w:eastAsia="Courier New" w:hAnsi="Courier New"/>
+          <w:color w:val="2C3E6B"/>
+          <w:sz w:val="18"/>
+          <w:szCs w:val="18"/>
+        </w:rPr>
+        <w:t xml:space="preserve">        WHEN value / 1e18 &lt; 1 THEN 'Medium (0.1-1 ETH)'</w:t>
+      </w:r>
+    </w:p>
+    <w:p>
+      <w:pPr>
+        <w:spacing w:after="40" w:before="40"/>
+        <w:ind w:left="360"/>
+      </w:pPr>
+      <w:r>
+        <w:rPr>
+          <w:rFonts w:ascii="Courier New" w:cs="Courier New" w:eastAsia="Courier New" w:hAnsi="Courier New"/>
+          <w:color w:val="2C3E6B"/>
+          <w:sz w:val="18"/>
+          <w:szCs w:val="18"/>
+        </w:rPr>
+        <w:t xml:space="preserve">        WHEN value / 1e18 &lt; 10 THEN 'Large (1-10 ETH)'</w:t>
+      </w:r>
+    </w:p>
+    <w:p>
+      <w:pPr>
+        <w:spacing w:after="40" w:before="40"/>
+        <w:ind w:left="360"/>
+      </w:pPr>
+      <w:r>
+        <w:rPr>
+          <w:rFonts w:ascii="Courier New" w:cs="Courier New" w:eastAsia="Courier New" w:hAnsi="Courier New"/>
+          <w:color w:val="2C3E6B"/>
+          <w:sz w:val="18"/>
+          <w:szCs w:val="18"/>
+        </w:rPr>
+        <w:t xml:space="preserve">        ELSE 'Whale (&gt;10 ETH)'</w:t>
+      </w:r>
+    </w:p>
+    <w:p>
+      <w:pPr>
+        <w:spacing w:after="40" w:before="40"/>
+        <w:ind w:left="360"/>
+      </w:pPr>
+      <w:r>
+        <w:rPr>
+          <w:rFonts w:ascii="Courier New" w:cs="Courier New" w:eastAsia="Courier New" w:hAnsi="Courier New"/>
+          <w:color w:val="2C3E6B"/>
+          <w:sz w:val="18"/>
+          <w:szCs w:val="18"/>
+        </w:rPr>
+        <w:t xml:space="preserve">    END AS transaction_size,</w:t>
+      </w:r>
+    </w:p>
+    <w:p>
+      <w:pPr>
+        <w:spacing w:after="40" w:before="40"/>
+        <w:ind w:left="360"/>
+      </w:pPr>
+      <w:r>
+        <w:rPr>
+          <w:rFonts w:ascii="Courier New" w:cs="Courier New" w:eastAsia="Courier New" w:hAnsi="Courier New"/>
+          <w:color w:val="2C3E6B"/>
+          <w:sz w:val="18"/>
+          <w:szCs w:val="18"/>
+        </w:rPr>
+        <w:t xml:space="preserve">    COUNT(*) AS count,</w:t>
+      </w:r>
+    </w:p>
+    <w:p>
+      <w:pPr>
+        <w:spacing w:after="40" w:before="40"/>
+        <w:ind w:left="360"/>
+      </w:pPr>
+      <w:r>
+        <w:rPr>
+          <w:rFonts w:ascii="Courier New" w:cs="Courier New" w:eastAsia="Courier New" w:hAnsi="Courier New"/>
+          <w:color w:val="2C3E6B"/>
+          <w:sz w:val="18"/>
+          <w:szCs w:val="18"/>
+        </w:rPr>
+        <w:t xml:space="preserve">    AVG((gas_used * gas_price / 1e18) / NULLIF(value / 1e18, 0) * 100) AS avg_fee_pct</w:t>
       </w:r>
     </w:p>
     <w:p>
@@ -6516,7 +6469,22 @@
           <w:sz w:val="18"/>
           <w:szCs w:val="18"/>
         </w:rPr>
-        <w:t xml:space="preserve">WHERE block_time &gt;= NOW() - INTERVAL '30' DAY</w:t>
+        <w:t xml:space="preserve">WHERE block_time &gt;= NOW() - INTERVAL '7' DAY</w:t>
+      </w:r>
+    </w:p>
+    <w:p>
+      <w:pPr>
+        <w:spacing w:after="40" w:before="40"/>
+        <w:ind w:left="360"/>
+      </w:pPr>
+      <w:r>
+        <w:rPr>
+          <w:rFonts w:ascii="Courier New" w:cs="Courier New" w:eastAsia="Courier New" w:hAnsi="Courier New"/>
+          <w:color w:val="2C3E6B"/>
+          <w:sz w:val="18"/>
+          <w:szCs w:val="18"/>
+        </w:rPr>
+        <w:t xml:space="preserve">    AND value &gt; 0</w:t>
       </w:r>
     </w:p>
     <w:p>
@@ -6561,29 +6529,29 @@
           <w:sz w:val="18"/>
           <w:szCs w:val="18"/>
         </w:rPr>
-        <w:t xml:space="preserve">ORDER BY 1</w:t>
-      </w:r>
-    </w:p>
-    <w:p>
-      <w:pPr>
-        <w:spacing w:after="80" w:before="80"/>
-      </w:pPr>
-      <w:r>
-        <w:t xml:space="preserve"/>
-      </w:r>
-    </w:p>
-    <w:p>
-      <w:pPr>
-        <w:spacing w:after="60" w:before="60"/>
-      </w:pPr>
-      <w:r>
-        <w:rPr>
-          <w:rFonts w:ascii="Arial" w:cs="Arial" w:eastAsia="Arial" w:hAnsi="Arial"/>
-          <w:color w:val="222222"/>
-          <w:sz w:val="20"/>
-          <w:szCs w:val="20"/>
-        </w:rPr>
-        <w:t xml:space="preserve">Visualize as a bar chart. The shape of this distribution is an empirical measurement of the geographic concentration of Ethereum activity — your first real data point for the geographic analysis framework developed in Stage 1.</w:t>
+        <w:t xml:space="preserve">ORDER BY 2 DESC</w:t>
+      </w:r>
+    </w:p>
+    <w:p>
+      <w:pPr>
+        <w:spacing w:after="80" w:before="80"/>
+      </w:pPr>
+      <w:r>
+        <w:t xml:space="preserve"/>
+      </w:r>
+    </w:p>
+    <w:p>
+      <w:pPr>
+        <w:spacing w:after="60" w:before="60"/>
+      </w:pPr>
+      <w:r>
+        <w:rPr>
+          <w:rFonts w:ascii="Arial" w:cs="Arial" w:eastAsia="Arial" w:hAnsi="Arial"/>
+          <w:color w:val="222222"/>
+          <w:sz w:val="20"/>
+          <w:szCs w:val="20"/>
+        </w:rPr>
+        <w:t xml:space="preserve">The result will show that small transactions pay a disproportionately high percentage of their value in fees. This is the economic argument for Layer 2 payments made visible in real data.</w:t>
       </w:r>
     </w:p>
     <w:p>
@@ -6607,43 +6575,21 @@
           <w:sz w:val="22"/>
           <w:szCs w:val="22"/>
         </w:rPr>
-        <w:t xml:space="preserve">Query 10: Your Original Research Query</w:t>
-      </w:r>
-    </w:p>
-    <w:p>
-      <w:pPr>
-        <w:spacing w:after="60" w:before="60"/>
-      </w:pPr>
-      <w:r>
-        <w:rPr>
-          <w:rFonts w:ascii="Arial" w:cs="Arial" w:eastAsia="Arial" w:hAnsi="Arial"/>
-          <w:color w:val="222222"/>
-          <w:sz w:val="20"/>
-          <w:szCs w:val="20"/>
-        </w:rPr>
-        <w:t xml:space="preserve">Query 10 is not provided. It is yours to formulate.</w:t>
-      </w:r>
-    </w:p>
-    <w:p>
-      <w:pPr>
-        <w:spacing w:after="80" w:before="80"/>
-      </w:pPr>
-      <w:r>
-        <w:t xml:space="preserve"/>
-      </w:r>
-    </w:p>
-    <w:p>
-      <w:pPr>
-        <w:spacing w:after="60" w:before="60"/>
-      </w:pPr>
-      <w:r>
-        <w:rPr>
-          <w:rFonts w:ascii="Arial" w:cs="Arial" w:eastAsia="Arial" w:hAnsi="Arial"/>
-          <w:color w:val="222222"/>
-          <w:sz w:val="20"/>
-          <w:szCs w:val="20"/>
-        </w:rPr>
-        <w:t xml:space="preserve">Using what you have learned from queries 1 through 9, formulate one original research question about crypto payment flows that interests you — ideally connected to your existing portfolio work. Some starting points:</w:t>
+        <w:t xml:space="preserve">What Query 8 Results Tell You</w:t>
+      </w:r>
+    </w:p>
+    <w:p>
+      <w:pPr>
+        <w:spacing w:after="60" w:before="60"/>
+      </w:pPr>
+      <w:r>
+        <w:rPr>
+          <w:rFonts w:ascii="Arial" w:cs="Arial" w:eastAsia="Arial" w:hAnsi="Arial"/>
+          <w:color w:val="222222"/>
+          <w:sz w:val="20"/>
+          <w:szCs w:val="20"/>
+        </w:rPr>
+        <w:t xml:space="preserve">The results from April 2026 revealed a pattern that makes the economic case for Layer 2 impossible to ignore:</w:t>
       </w:r>
     </w:p>
     <w:p>
@@ -6677,16 +6623,16 @@
           <w:sz w:val="20"/>
           <w:szCs w:val="20"/>
         </w:rPr>
-        <w:t xml:space="preserve">Geopolitical connection:</w:t>
-      </w:r>
-      <w:r>
-        <w:rPr>
-          <w:rFonts w:ascii="Arial" w:cs="Arial" w:eastAsia="Arial" w:hAnsi="Arial"/>
-          <w:color w:val="222222"/>
-          <w:sz w:val="20"/>
-          <w:szCs w:val="20"/>
-        </w:rPr>
-        <w:t xml:space="preserve"> Did USDC payment volumes on Ethereum change during the conflict escalation events you analyzed in the crypto geopolitical project?</w:t>
+        <w:t xml:space="preserve">Micro transactions (&lt;0.01 ETH)</w:t>
+      </w:r>
+      <w:r>
+        <w:rPr>
+          <w:rFonts w:ascii="Arial" w:cs="Arial" w:eastAsia="Arial" w:hAnsi="Arial"/>
+          <w:color w:val="222222"/>
+          <w:sz w:val="20"/>
+          <w:szCs w:val="20"/>
+        </w:rPr>
+        <w:t xml:space="preserve">: 3,258,588 transactions — avg fee percentage: 234,445,286,532,103%</w:t>
       </w:r>
     </w:p>
     <w:p>
@@ -6712,16 +6658,16 @@
           <w:sz w:val="20"/>
           <w:szCs w:val="20"/>
         </w:rPr>
-        <w:t xml:space="preserve">Netherlands relevance:</w:t>
-      </w:r>
-      <w:r>
-        <w:rPr>
-          <w:rFonts w:ascii="Arial" w:cs="Arial" w:eastAsia="Arial" w:hAnsi="Arial"/>
-          <w:color w:val="222222"/>
-          <w:sz w:val="20"/>
-          <w:szCs w:val="20"/>
-        </w:rPr>
-        <w:t xml:space="preserve"> Is there any on-chain evidence of EURC adoption relative to USDC on Ethereum?</w:t>
+        <w:t xml:space="preserve">Small transactions (0.01-0.1 ETH)</w:t>
+      </w:r>
+      <w:r>
+        <w:rPr>
+          <w:rFonts w:ascii="Arial" w:cs="Arial" w:eastAsia="Arial" w:hAnsi="Arial"/>
+          <w:color w:val="222222"/>
+          <w:sz w:val="20"/>
+          <w:szCs w:val="20"/>
+        </w:rPr>
+        <w:t xml:space="preserve">: 1,555,590 transactions — avg fee percentage: 1.01%</w:t>
       </w:r>
     </w:p>
     <w:p>
@@ -6747,16 +6693,16 @@
           <w:sz w:val="20"/>
           <w:szCs w:val="20"/>
         </w:rPr>
-        <w:t xml:space="preserve">Layer 2 migration:</w:t>
-      </w:r>
-      <w:r>
-        <w:rPr>
-          <w:rFonts w:ascii="Arial" w:cs="Arial" w:eastAsia="Arial" w:hAnsi="Arial"/>
-          <w:color w:val="222222"/>
-          <w:sz w:val="20"/>
-          <w:szCs w:val="20"/>
-        </w:rPr>
-        <w:t xml:space="preserve"> At what point in 2024–2025 did Arbitrum USDC transfers first exceed Ethereum mainnet USDC transfers?</w:t>
+        <w:t xml:space="preserve">Medium transactions (0.1-1 ETH)</w:t>
+      </w:r>
+      <w:r>
+        <w:rPr>
+          <w:rFonts w:ascii="Arial" w:cs="Arial" w:eastAsia="Arial" w:hAnsi="Arial"/>
+          <w:color w:val="222222"/>
+          <w:sz w:val="20"/>
+          <w:szCs w:val="20"/>
+        </w:rPr>
+        <w:t xml:space="preserve">: 826,867 transactions — avg fee percentage: 0.36%</w:t>
       </w:r>
     </w:p>
     <w:p>
@@ -6782,16 +6728,785 @@
           <w:sz w:val="20"/>
           <w:szCs w:val="20"/>
         </w:rPr>
-        <w:t xml:space="preserve">Mempool urgency:</w:t>
-      </w:r>
-      <w:r>
-        <w:rPr>
-          <w:rFonts w:ascii="Arial" w:cs="Arial" w:eastAsia="Arial" w:hAnsi="Arial"/>
-          <w:color w:val="222222"/>
-          <w:sz w:val="20"/>
-          <w:szCs w:val="20"/>
-        </w:rPr>
-        <w:t xml:space="preserve"> Do gas fee spikes on Ethereum correlate with USDC transfer volume spikes on the same day?</w:t>
+        <w:t xml:space="preserve">Large transactions (1-10 ETH)</w:t>
+      </w:r>
+      <w:r>
+        <w:rPr>
+          <w:rFonts w:ascii="Arial" w:cs="Arial" w:eastAsia="Arial" w:hAnsi="Arial"/>
+          <w:color w:val="222222"/>
+          <w:sz w:val="20"/>
+          <w:szCs w:val="20"/>
+        </w:rPr>
+        <w:t xml:space="preserve">: 196,872 transactions — avg fee percentage: 0.033%</w:t>
+      </w:r>
+    </w:p>
+    <w:p>
+      <w:pPr>
+        <w:spacing w:after="60" w:before="60"/>
+        <w:ind w:left="360"/>
+      </w:pPr>
+      <w:r>
+        <w:rPr>
+          <w:rFonts w:ascii="Arial" w:cs="Arial" w:eastAsia="Arial" w:hAnsi="Arial"/>
+          <w:color w:val="1A7A8A"/>
+          <w:sz w:val="20"/>
+          <w:szCs w:val="20"/>
+        </w:rPr>
+        <w:t xml:space="preserve">◆  </w:t>
+      </w:r>
+      <w:r>
+        <w:rPr>
+          <w:rFonts w:ascii="Arial" w:cs="Arial" w:eastAsia="Arial" w:hAnsi="Arial"/>
+          <w:b/>
+          <w:bCs/>
+          <w:color w:val="222222"/>
+          <w:sz w:val="20"/>
+          <w:szCs w:val="20"/>
+        </w:rPr>
+        <w:t xml:space="preserve">Whale transactions (&gt;10 ETH)</w:t>
+      </w:r>
+      <w:r>
+        <w:rPr>
+          <w:rFonts w:ascii="Arial" w:cs="Arial" w:eastAsia="Arial" w:hAnsi="Arial"/>
+          <w:color w:val="222222"/>
+          <w:sz w:val="20"/>
+          <w:szCs w:val="20"/>
+        </w:rPr>
+        <w:t xml:space="preserve">: 58,318 transactions — avg fee percentage: 0.002%</w:t>
+      </w:r>
+    </w:p>
+    <w:p>
+      <w:pPr>
+        <w:spacing w:after="80" w:before="80"/>
+      </w:pPr>
+      <w:r>
+        <w:t xml:space="preserve"/>
+      </w:r>
+    </w:p>
+    <w:p>
+      <w:pPr>
+        <w:spacing w:after="60" w:before="60"/>
+      </w:pPr>
+      <w:r>
+        <w:rPr>
+          <w:rFonts w:ascii="Arial" w:cs="Arial" w:eastAsia="Arial" w:hAnsi="Arial"/>
+          <w:color w:val="222222"/>
+          <w:sz w:val="20"/>
+          <w:szCs w:val="20"/>
+        </w:rPr>
+        <w:t xml:space="preserve">The micro transaction fee percentage is astronomically high because the NULLIF division produces extreme outliers when transaction values approach zero — this is a known mathematical artifact of the calculation method, not a real fee rate. The meaningful insight is in the Small through Whale categories.</w:t>
+      </w:r>
+    </w:p>
+    <w:p>
+      <w:pPr>
+        <w:spacing w:after="80" w:before="80"/>
+      </w:pPr>
+      <w:r>
+        <w:t xml:space="preserve"/>
+      </w:r>
+    </w:p>
+    <w:p>
+      <w:pPr>
+        <w:spacing w:after="60" w:before="60"/>
+      </w:pPr>
+      <w:r>
+        <w:rPr>
+          <w:rFonts w:ascii="Arial" w:cs="Arial" w:eastAsia="Arial" w:hAnsi="Arial"/>
+          <w:color w:val="222222"/>
+          <w:sz w:val="20"/>
+          <w:szCs w:val="20"/>
+        </w:rPr>
+        <w:t xml:space="preserve">For small transactions (0.01 to 0.1 ETH), the average fee is approximately 1% of the transaction value. For whale transactions above 10 ETH, the fee is only 0.002% — essentially free at scale. This confirms the fundamental economic problem with Ethereum mainnet for everyday payments: gas fees are a fixed cost, not a percentage of transaction value. The same fee that costs a whale 0.002% costs a small payer 1% or more. Ethereum mainnet is economically efficient for large transfers and economically irrational for small ones — precisely why Layer 2 networks exist.</w:t>
+      </w:r>
+    </w:p>
+    <w:p>
+      <w:pPr>
+        <w:spacing w:after="80" w:before="80"/>
+      </w:pPr>
+      <w:r>
+        <w:t xml:space="preserve"/>
+      </w:r>
+    </w:p>
+    <w:p>
+      <w:pPr>
+        <w:spacing w:after="60" w:before="200"/>
+      </w:pPr>
+      <w:r>
+        <w:rPr>
+          <w:rFonts w:ascii="Arial" w:cs="Arial" w:eastAsia="Arial" w:hAnsi="Arial"/>
+          <w:b/>
+          <w:bCs/>
+          <w:color w:val="2C3E6B"/>
+          <w:sz w:val="22"/>
+          <w:szCs w:val="22"/>
+        </w:rPr>
+        <w:t xml:space="preserve">Query 9: Payment Velocity — Transactions Per Hour</w:t>
+      </w:r>
+    </w:p>
+    <w:p>
+      <w:pPr>
+        <w:spacing w:after="60" w:before="60"/>
+      </w:pPr>
+      <w:r>
+        <w:rPr>
+          <w:rFonts w:ascii="Arial" w:cs="Arial" w:eastAsia="Arial" w:hAnsi="Arial"/>
+          <w:color w:val="222222"/>
+          <w:sz w:val="20"/>
+          <w:szCs w:val="20"/>
+        </w:rPr>
+        <w:t xml:space="preserve">This query measures transaction counts by hour of day, averaged across the last 30 days. It reveals the circadian rhythm of blockchain payment activity — when during the day are most payments processed? This connects to the geographic propagation analysis from Stage 1: peaks during US and European business hours would suggest Western market dominance.</w:t>
+      </w:r>
+    </w:p>
+    <w:p>
+      <w:pPr>
+        <w:spacing w:after="80" w:before="80"/>
+      </w:pPr>
+      <w:r>
+        <w:t xml:space="preserve"/>
+      </w:r>
+    </w:p>
+    <w:p>
+      <w:pPr>
+        <w:spacing w:after="40" w:before="40"/>
+        <w:ind w:left="360"/>
+      </w:pPr>
+      <w:r>
+        <w:rPr>
+          <w:rFonts w:ascii="Courier New" w:cs="Courier New" w:eastAsia="Courier New" w:hAnsi="Courier New"/>
+          <w:color w:val="2C3E6B"/>
+          <w:sz w:val="18"/>
+          <w:szCs w:val="18"/>
+        </w:rPr>
+        <w:t xml:space="preserve">SELECT</w:t>
+      </w:r>
+    </w:p>
+    <w:p>
+      <w:pPr>
+        <w:spacing w:after="40" w:before="40"/>
+        <w:ind w:left="360"/>
+      </w:pPr>
+      <w:r>
+        <w:rPr>
+          <w:rFonts w:ascii="Courier New" w:cs="Courier New" w:eastAsia="Courier New" w:hAnsi="Courier New"/>
+          <w:color w:val="2C3E6B"/>
+          <w:sz w:val="18"/>
+          <w:szCs w:val="18"/>
+        </w:rPr>
+        <w:t xml:space="preserve">    HOUR(block_time) AS hour_of_day,</w:t>
+      </w:r>
+    </w:p>
+    <w:p>
+      <w:pPr>
+        <w:spacing w:after="40" w:before="40"/>
+        <w:ind w:left="360"/>
+      </w:pPr>
+      <w:r>
+        <w:rPr>
+          <w:rFonts w:ascii="Courier New" w:cs="Courier New" w:eastAsia="Courier New" w:hAnsi="Courier New"/>
+          <w:color w:val="2C3E6B"/>
+          <w:sz w:val="18"/>
+          <w:szCs w:val="18"/>
+        </w:rPr>
+        <w:t xml:space="preserve">    COUNT(*) / 30.0 AS avg_daily_transactions</w:t>
+      </w:r>
+    </w:p>
+    <w:p>
+      <w:pPr>
+        <w:spacing w:after="40" w:before="40"/>
+        <w:ind w:left="360"/>
+      </w:pPr>
+      <w:r>
+        <w:rPr>
+          <w:rFonts w:ascii="Courier New" w:cs="Courier New" w:eastAsia="Courier New" w:hAnsi="Courier New"/>
+          <w:color w:val="2C3E6B"/>
+          <w:sz w:val="18"/>
+          <w:szCs w:val="18"/>
+        </w:rPr>
+        <w:t xml:space="preserve">FROM ethereum.transactions</w:t>
+      </w:r>
+    </w:p>
+    <w:p>
+      <w:pPr>
+        <w:spacing w:after="40" w:before="40"/>
+        <w:ind w:left="360"/>
+      </w:pPr>
+      <w:r>
+        <w:rPr>
+          <w:rFonts w:ascii="Courier New" w:cs="Courier New" w:eastAsia="Courier New" w:hAnsi="Courier New"/>
+          <w:color w:val="2C3E6B"/>
+          <w:sz w:val="18"/>
+          <w:szCs w:val="18"/>
+        </w:rPr>
+        <w:t xml:space="preserve">WHERE block_time &gt;= NOW() - INTERVAL '30' DAY</w:t>
+      </w:r>
+    </w:p>
+    <w:p>
+      <w:pPr>
+        <w:spacing w:after="40" w:before="40"/>
+        <w:ind w:left="360"/>
+      </w:pPr>
+      <w:r>
+        <w:rPr>
+          <w:rFonts w:ascii="Courier New" w:cs="Courier New" w:eastAsia="Courier New" w:hAnsi="Courier New"/>
+          <w:color w:val="2C3E6B"/>
+          <w:sz w:val="18"/>
+          <w:szCs w:val="18"/>
+        </w:rPr>
+        <w:t xml:space="preserve">    AND success = TRUE</w:t>
+      </w:r>
+    </w:p>
+    <w:p>
+      <w:pPr>
+        <w:spacing w:after="40" w:before="40"/>
+        <w:ind w:left="360"/>
+      </w:pPr>
+      <w:r>
+        <w:rPr>
+          <w:rFonts w:ascii="Courier New" w:cs="Courier New" w:eastAsia="Courier New" w:hAnsi="Courier New"/>
+          <w:color w:val="2C3E6B"/>
+          <w:sz w:val="18"/>
+          <w:szCs w:val="18"/>
+        </w:rPr>
+        <w:t xml:space="preserve">GROUP BY 1</w:t>
+      </w:r>
+    </w:p>
+    <w:p>
+      <w:pPr>
+        <w:spacing w:after="40" w:before="40"/>
+        <w:ind w:left="360"/>
+      </w:pPr>
+      <w:r>
+        <w:rPr>
+          <w:rFonts w:ascii="Courier New" w:cs="Courier New" w:eastAsia="Courier New" w:hAnsi="Courier New"/>
+          <w:color w:val="2C3E6B"/>
+          <w:sz w:val="18"/>
+          <w:szCs w:val="18"/>
+        </w:rPr>
+        <w:t xml:space="preserve">ORDER BY 1</w:t>
+      </w:r>
+    </w:p>
+    <w:p>
+      <w:pPr>
+        <w:spacing w:after="80" w:before="80"/>
+      </w:pPr>
+      <w:r>
+        <w:t xml:space="preserve"/>
+      </w:r>
+    </w:p>
+    <w:p>
+      <w:pPr>
+        <w:spacing w:after="60" w:before="60"/>
+      </w:pPr>
+      <w:r>
+        <w:rPr>
+          <w:rFonts w:ascii="Arial" w:cs="Arial" w:eastAsia="Arial" w:hAnsi="Arial"/>
+          <w:color w:val="222222"/>
+          <w:sz w:val="20"/>
+          <w:szCs w:val="20"/>
+        </w:rPr>
+        <w:t xml:space="preserve">Visualize as a bar chart. The shape of this distribution is an empirical measurement of the geographic concentration of Ethereum activity — your first real data point for the geographic analysis framework developed in Stage 1.</w:t>
+      </w:r>
+    </w:p>
+    <w:p>
+      <w:pPr>
+        <w:spacing w:after="80" w:before="80"/>
+      </w:pPr>
+      <w:r>
+        <w:t xml:space="preserve"/>
+      </w:r>
+    </w:p>
+    <w:p>
+      <w:pPr>
+        <w:spacing w:after="60" w:before="200"/>
+      </w:pPr>
+      <w:r>
+        <w:rPr>
+          <w:rFonts w:ascii="Arial" w:cs="Arial" w:eastAsia="Arial" w:hAnsi="Arial"/>
+          <w:b/>
+          <w:bCs/>
+          <w:color w:val="2C3E6B"/>
+          <w:sz w:val="22"/>
+          <w:szCs w:val="22"/>
+        </w:rPr>
+        <w:t xml:space="preserve">What Query 9 Results Tell You</w:t>
+      </w:r>
+    </w:p>
+    <w:p>
+      <w:pPr>
+        <w:spacing w:after="60" w:before="60"/>
+      </w:pPr>
+      <w:r>
+        <w:rPr>
+          <w:rFonts w:ascii="Arial" w:cs="Arial" w:eastAsia="Arial" w:hAnsi="Arial"/>
+          <w:color w:val="222222"/>
+          <w:sz w:val="20"/>
+          <w:szCs w:val="20"/>
+        </w:rPr>
+        <w:t xml:space="preserve">The results from the last 30 days show a remarkably flat distribution — approximately 89,000 to 100,000 average daily transactions per hour throughout the entire 24-hour cycle. There is no dramatic peak during any specific business hour region.</w:t>
+      </w:r>
+    </w:p>
+    <w:p>
+      <w:pPr>
+        <w:spacing w:after="80" w:before="80"/>
+      </w:pPr>
+      <w:r>
+        <w:t xml:space="preserve"/>
+      </w:r>
+    </w:p>
+    <w:p>
+      <w:pPr>
+        <w:spacing w:after="60" w:before="60"/>
+      </w:pPr>
+      <w:r>
+        <w:rPr>
+          <w:rFonts w:ascii="Arial" w:cs="Arial" w:eastAsia="Arial" w:hAnsi="Arial"/>
+          <w:color w:val="222222"/>
+          <w:sz w:val="20"/>
+          <w:szCs w:val="20"/>
+        </w:rPr>
+        <w:t xml:space="preserve">This flatness is itself an important finding. It suggests that Ethereum transaction activity is genuinely global — distributed across time zones without a single dominant region driving activity. If US or European activity dominated, we would expect clear peaks during those business hours and significant troughs during Asian night hours. The absence of such peaks indicates that the network is used around the clock by actors in every timezone.</w:t>
+      </w:r>
+    </w:p>
+    <w:p>
+      <w:pPr>
+        <w:spacing w:after="80" w:before="80"/>
+      </w:pPr>
+      <w:r>
+        <w:t xml:space="preserve"/>
+      </w:r>
+    </w:p>
+    <w:p>
+      <w:pPr>
+        <w:spacing w:after="60" w:before="60"/>
+      </w:pPr>
+      <w:r>
+        <w:rPr>
+          <w:rFonts w:ascii="Arial" w:cs="Arial" w:eastAsia="Arial" w:hAnsi="Arial"/>
+          <w:color w:val="222222"/>
+          <w:sz w:val="20"/>
+          <w:szCs w:val="20"/>
+        </w:rPr>
+        <w:t xml:space="preserve">This finding partially challenges the geographic propagation hypothesis from Stage 1. While specific urgency events may originate from particular regions — as the mempool fee spike analysis suggested — baseline transaction activity appears genuinely distributed globally. The implication for payment analysis is that Ethereum has achieved true 24/7 global payment infrastructure, unlike traditional banking systems which follow regional business hours.</w:t>
+      </w:r>
+    </w:p>
+    <w:p>
+      <w:pPr>
+        <w:spacing w:after="80" w:before="80"/>
+      </w:pPr>
+      <w:r>
+        <w:t xml:space="preserve"/>
+      </w:r>
+    </w:p>
+    <w:p>
+      <w:pPr>
+        <w:spacing w:after="60" w:before="200"/>
+      </w:pPr>
+      <w:r>
+        <w:rPr>
+          <w:rFonts w:ascii="Arial" w:cs="Arial" w:eastAsia="Arial" w:hAnsi="Arial"/>
+          <w:b/>
+          <w:bCs/>
+          <w:color w:val="2C3E6B"/>
+          <w:sz w:val="22"/>
+          <w:szCs w:val="22"/>
+        </w:rPr>
+        <w:t xml:space="preserve">Query 10: Geopolitical Impact on USDC Payment Flows (Original Research)</w:t>
+      </w:r>
+    </w:p>
+    <w:p>
+      <w:pPr>
+        <w:spacing w:after="60" w:before="60"/>
+      </w:pPr>
+      <w:r>
+        <w:rPr>
+          <w:rFonts w:ascii="Arial" w:cs="Arial" w:eastAsia="Arial" w:hAnsi="Arial"/>
+          <w:color w:val="222222"/>
+          <w:sz w:val="20"/>
+          <w:szCs w:val="20"/>
+        </w:rPr>
+        <w:t xml:space="preserve">Research question: Did USDC payment volumes on Ethereum change during the Iran-Israel-USA conflict escalation events documented in the companion crypto geopolitical analysis project?</w:t>
+      </w:r>
+    </w:p>
+    <w:p>
+      <w:pPr>
+        <w:spacing w:after="80" w:before="80"/>
+      </w:pPr>
+      <w:r>
+        <w:t xml:space="preserve"/>
+      </w:r>
+    </w:p>
+    <w:p>
+      <w:pPr>
+        <w:spacing w:after="60" w:before="60"/>
+      </w:pPr>
+      <w:r>
+        <w:rPr>
+          <w:rFonts w:ascii="Arial" w:cs="Arial" w:eastAsia="Arial" w:hAnsi="Arial"/>
+          <w:color w:val="222222"/>
+          <w:sz w:val="20"/>
+          <w:szCs w:val="20"/>
+        </w:rPr>
+        <w:t xml:space="preserve">This query pulls daily USDC transfer volume from October 2023 — before the conflict began — through April 2026, covering all nine key escalation events identified in the geopolitical project.</w:t>
+      </w:r>
+    </w:p>
+    <w:p>
+      <w:pPr>
+        <w:spacing w:after="80" w:before="80"/>
+      </w:pPr>
+      <w:r>
+        <w:t xml:space="preserve"/>
+      </w:r>
+    </w:p>
+    <w:p>
+      <w:pPr>
+        <w:spacing w:after="40" w:before="40"/>
+        <w:ind w:left="360"/>
+      </w:pPr>
+      <w:r>
+        <w:rPr>
+          <w:rFonts w:ascii="Courier New" w:cs="Courier New" w:eastAsia="Courier New" w:hAnsi="Courier New"/>
+          <w:color w:val="2C3E6B"/>
+          <w:sz w:val="18"/>
+          <w:szCs w:val="18"/>
+        </w:rPr>
+        <w:t xml:space="preserve">SELECT</w:t>
+      </w:r>
+    </w:p>
+    <w:p>
+      <w:pPr>
+        <w:spacing w:after="40" w:before="40"/>
+        <w:ind w:left="360"/>
+      </w:pPr>
+      <w:r>
+        <w:rPr>
+          <w:rFonts w:ascii="Courier New" w:cs="Courier New" w:eastAsia="Courier New" w:hAnsi="Courier New"/>
+          <w:color w:val="2C3E6B"/>
+          <w:sz w:val="18"/>
+          <w:szCs w:val="18"/>
+        </w:rPr>
+        <w:t xml:space="preserve">    DATE_TRUNC('day', evt_block_time) AS date,</w:t>
+      </w:r>
+    </w:p>
+    <w:p>
+      <w:pPr>
+        <w:spacing w:after="40" w:before="40"/>
+        <w:ind w:left="360"/>
+      </w:pPr>
+      <w:r>
+        <w:rPr>
+          <w:rFonts w:ascii="Courier New" w:cs="Courier New" w:eastAsia="Courier New" w:hAnsi="Courier New"/>
+          <w:color w:val="2C3E6B"/>
+          <w:sz w:val="18"/>
+          <w:szCs w:val="18"/>
+        </w:rPr>
+        <w:t xml:space="preserve">    COUNT(*) AS transfer_count,</w:t>
+      </w:r>
+    </w:p>
+    <w:p>
+      <w:pPr>
+        <w:spacing w:after="40" w:before="40"/>
+        <w:ind w:left="360"/>
+      </w:pPr>
+      <w:r>
+        <w:rPr>
+          <w:rFonts w:ascii="Courier New" w:cs="Courier New" w:eastAsia="Courier New" w:hAnsi="Courier New"/>
+          <w:color w:val="2C3E6B"/>
+          <w:sz w:val="18"/>
+          <w:szCs w:val="18"/>
+        </w:rPr>
+        <w:t xml:space="preserve">    SUM(value / 1e6) AS usdc_volume</w:t>
+      </w:r>
+    </w:p>
+    <w:p>
+      <w:pPr>
+        <w:spacing w:after="40" w:before="40"/>
+        <w:ind w:left="360"/>
+      </w:pPr>
+      <w:r>
+        <w:rPr>
+          <w:rFonts w:ascii="Courier New" w:cs="Courier New" w:eastAsia="Courier New" w:hAnsi="Courier New"/>
+          <w:color w:val="2C3E6B"/>
+          <w:sz w:val="18"/>
+          <w:szCs w:val="18"/>
+        </w:rPr>
+        <w:t xml:space="preserve">FROM erc20_ethereum.evt_Transfer</w:t>
+      </w:r>
+    </w:p>
+    <w:p>
+      <w:pPr>
+        <w:spacing w:after="40" w:before="40"/>
+        <w:ind w:left="360"/>
+      </w:pPr>
+      <w:r>
+        <w:rPr>
+          <w:rFonts w:ascii="Courier New" w:cs="Courier New" w:eastAsia="Courier New" w:hAnsi="Courier New"/>
+          <w:color w:val="2C3E6B"/>
+          <w:sz w:val="18"/>
+          <w:szCs w:val="18"/>
+        </w:rPr>
+        <w:t xml:space="preserve">WHERE contract_address = 0xa0b86991c6218b36c1d19d4a2e9eb0ce3606eb48</w:t>
+      </w:r>
+    </w:p>
+    <w:p>
+      <w:pPr>
+        <w:spacing w:after="40" w:before="40"/>
+        <w:ind w:left="360"/>
+      </w:pPr>
+      <w:r>
+        <w:rPr>
+          <w:rFonts w:ascii="Courier New" w:cs="Courier New" w:eastAsia="Courier New" w:hAnsi="Courier New"/>
+          <w:color w:val="2C3E6B"/>
+          <w:sz w:val="18"/>
+          <w:szCs w:val="18"/>
+        </w:rPr>
+        <w:t xml:space="preserve">    AND evt_block_time &gt;= TIMESTAMP '2023-10-01'</w:t>
+      </w:r>
+    </w:p>
+    <w:p>
+      <w:pPr>
+        <w:spacing w:after="40" w:before="40"/>
+        <w:ind w:left="360"/>
+      </w:pPr>
+      <w:r>
+        <w:rPr>
+          <w:rFonts w:ascii="Courier New" w:cs="Courier New" w:eastAsia="Courier New" w:hAnsi="Courier New"/>
+          <w:color w:val="2C3E6B"/>
+          <w:sz w:val="18"/>
+          <w:szCs w:val="18"/>
+        </w:rPr>
+        <w:t xml:space="preserve">GROUP BY 1</w:t>
+      </w:r>
+    </w:p>
+    <w:p>
+      <w:pPr>
+        <w:spacing w:after="40" w:before="40"/>
+        <w:ind w:left="360"/>
+      </w:pPr>
+      <w:r>
+        <w:rPr>
+          <w:rFonts w:ascii="Courier New" w:cs="Courier New" w:eastAsia="Courier New" w:hAnsi="Courier New"/>
+          <w:color w:val="2C3E6B"/>
+          <w:sz w:val="18"/>
+          <w:szCs w:val="18"/>
+        </w:rPr>
+        <w:t xml:space="preserve">ORDER BY 1</w:t>
+      </w:r>
+    </w:p>
+    <w:p>
+      <w:pPr>
+        <w:spacing w:after="80" w:before="80"/>
+      </w:pPr>
+      <w:r>
+        <w:t xml:space="preserve"/>
+      </w:r>
+    </w:p>
+    <w:p>
+      <w:pPr>
+        <w:spacing w:after="60" w:before="200"/>
+      </w:pPr>
+      <w:r>
+        <w:rPr>
+          <w:rFonts w:ascii="Arial" w:cs="Arial" w:eastAsia="Arial" w:hAnsi="Arial"/>
+          <w:b/>
+          <w:bCs/>
+          <w:color w:val="2C3E6B"/>
+          <w:sz w:val="22"/>
+          <w:szCs w:val="22"/>
+        </w:rPr>
+        <w:t xml:space="preserve">What Query 10 Results Tell You</w:t>
+      </w:r>
+    </w:p>
+    <w:p>
+      <w:pPr>
+        <w:spacing w:after="60" w:before="60"/>
+      </w:pPr>
+      <w:r>
+        <w:rPr>
+          <w:rFonts w:ascii="Arial" w:cs="Arial" w:eastAsia="Arial" w:hAnsi="Arial"/>
+          <w:color w:val="222222"/>
+          <w:sz w:val="20"/>
+          <w:szCs w:val="20"/>
+        </w:rPr>
+        <w:t xml:space="preserve">The results span October 2023 through April 2026 — 2.5 years of USDC payment data covering the entire conflict timeline. The most immediate finding appears on the first key event date:</w:t>
+      </w:r>
+    </w:p>
+    <w:p>
+      <w:pPr>
+        <w:spacing w:after="80" w:before="80"/>
+      </w:pPr>
+      <w:r>
+        <w:t xml:space="preserve"/>
+      </w:r>
+    </w:p>
+    <w:p>
+      <w:pPr>
+        <w:spacing w:after="60" w:before="60"/>
+        <w:ind w:left="360"/>
+      </w:pPr>
+      <w:r>
+        <w:rPr>
+          <w:rFonts w:ascii="Arial" w:cs="Arial" w:eastAsia="Arial" w:hAnsi="Arial"/>
+          <w:color w:val="1A7A8A"/>
+          <w:sz w:val="20"/>
+          <w:szCs w:val="20"/>
+        </w:rPr>
+        <w:t xml:space="preserve">◆  </w:t>
+      </w:r>
+      <w:r>
+        <w:rPr>
+          <w:rFonts w:ascii="Arial" w:cs="Arial" w:eastAsia="Arial" w:hAnsi="Arial"/>
+          <w:b/>
+          <w:bCs/>
+          <w:color w:val="222222"/>
+          <w:sz w:val="20"/>
+          <w:szCs w:val="20"/>
+        </w:rPr>
+        <w:t xml:space="preserve">October 6, 2023 (day before Hamas attack)</w:t>
+      </w:r>
+      <w:r>
+        <w:rPr>
+          <w:rFonts w:ascii="Arial" w:cs="Arial" w:eastAsia="Arial" w:hAnsi="Arial"/>
+          <w:color w:val="222222"/>
+          <w:sz w:val="20"/>
+          <w:szCs w:val="20"/>
+        </w:rPr>
+        <w:t xml:space="preserve">: 54,835 transfers, USD 6.67 billion</w:t>
+      </w:r>
+    </w:p>
+    <w:p>
+      <w:pPr>
+        <w:spacing w:after="60" w:before="60"/>
+        <w:ind w:left="360"/>
+      </w:pPr>
+      <w:r>
+        <w:rPr>
+          <w:rFonts w:ascii="Arial" w:cs="Arial" w:eastAsia="Arial" w:hAnsi="Arial"/>
+          <w:color w:val="1A7A8A"/>
+          <w:sz w:val="20"/>
+          <w:szCs w:val="20"/>
+        </w:rPr>
+        <w:t xml:space="preserve">◆  </w:t>
+      </w:r>
+      <w:r>
+        <w:rPr>
+          <w:rFonts w:ascii="Arial" w:cs="Arial" w:eastAsia="Arial" w:hAnsi="Arial"/>
+          <w:b/>
+          <w:bCs/>
+          <w:color w:val="222222"/>
+          <w:sz w:val="20"/>
+          <w:szCs w:val="20"/>
+        </w:rPr>
+        <w:t xml:space="preserve">October 7, 2023 (Hamas attacks Israel)</w:t>
+      </w:r>
+      <w:r>
+        <w:rPr>
+          <w:rFonts w:ascii="Arial" w:cs="Arial" w:eastAsia="Arial" w:hAnsi="Arial"/>
+          <w:color w:val="222222"/>
+          <w:sz w:val="20"/>
+          <w:szCs w:val="20"/>
+        </w:rPr>
+        <w:t xml:space="preserve">: 38,209 transfers, USD 2.24 billion</w:t>
+      </w:r>
+    </w:p>
+    <w:p>
+      <w:pPr>
+        <w:spacing w:after="60" w:before="60"/>
+        <w:ind w:left="360"/>
+      </w:pPr>
+      <w:r>
+        <w:rPr>
+          <w:rFonts w:ascii="Arial" w:cs="Arial" w:eastAsia="Arial" w:hAnsi="Arial"/>
+          <w:color w:val="1A7A8A"/>
+          <w:sz w:val="20"/>
+          <w:szCs w:val="20"/>
+        </w:rPr>
+        <w:t xml:space="preserve">◆  </w:t>
+      </w:r>
+      <w:r>
+        <w:rPr>
+          <w:rFonts w:ascii="Arial" w:cs="Arial" w:eastAsia="Arial" w:hAnsi="Arial"/>
+          <w:b/>
+          <w:bCs/>
+          <w:color w:val="222222"/>
+          <w:sz w:val="20"/>
+          <w:szCs w:val="20"/>
+        </w:rPr>
+        <w:t xml:space="preserve">October 8, 2023 (day after)</w:t>
+      </w:r>
+      <w:r>
+        <w:rPr>
+          <w:rFonts w:ascii="Arial" w:cs="Arial" w:eastAsia="Arial" w:hAnsi="Arial"/>
+          <w:color w:val="222222"/>
+          <w:sz w:val="20"/>
+          <w:szCs w:val="20"/>
+        </w:rPr>
+        <w:t xml:space="preserve">: 37,698 transfers, USD 2.47 billion</w:t>
+      </w:r>
+    </w:p>
+    <w:p>
+      <w:pPr>
+        <w:spacing w:after="80" w:before="80"/>
+      </w:pPr>
+      <w:r>
+        <w:t xml:space="preserve"/>
+      </w:r>
+    </w:p>
+    <w:p>
+      <w:pPr>
+        <w:spacing w:after="60" w:before="60"/>
+      </w:pPr>
+      <w:r>
+        <w:rPr>
+          <w:rFonts w:ascii="Arial" w:cs="Arial" w:eastAsia="Arial" w:hAnsi="Arial"/>
+          <w:color w:val="222222"/>
+          <w:sz w:val="20"/>
+          <w:szCs w:val="20"/>
+        </w:rPr>
+        <w:t xml:space="preserve">USDC payment volume dropped by 66% on the day of the October 7 attack compared to the previous day. Markets froze. Transaction activity collapsed. The shock is directly visible in the payment data.</w:t>
+      </w:r>
+    </w:p>
+    <w:p>
+      <w:pPr>
+        <w:spacing w:after="80" w:before="80"/>
+      </w:pPr>
+      <w:r>
+        <w:t xml:space="preserve"/>
+      </w:r>
+    </w:p>
+    <w:p>
+      <w:pPr>
+        <w:spacing w:after="60" w:before="60"/>
+      </w:pPr>
+      <w:r>
+        <w:rPr>
+          <w:rFonts w:ascii="Arial" w:cs="Arial" w:eastAsia="Arial" w:hAnsi="Arial"/>
+          <w:color w:val="222222"/>
+          <w:sz w:val="20"/>
+          <w:szCs w:val="20"/>
+        </w:rPr>
+        <w:t xml:space="preserve">This finding connects two separate portfolio projects into a single coherent research thread. The crypto geopolitical analysis project showed that BTC and ETH prices fell after the October 7 attack. This query shows that USDC payment volume — a measure of real economic activity, not just price — also collapsed simultaneously. Price reactions and payment behavior moved together, suggesting that the shock affected not just speculative sentiment but actual transactional demand.</w:t>
+      </w:r>
+    </w:p>
+    <w:p>
+      <w:pPr>
+        <w:spacing w:after="80" w:before="80"/>
+      </w:pPr>
+      <w:r>
+        <w:t xml:space="preserve"/>
+      </w:r>
+    </w:p>
+    <w:p>
+      <w:pPr>
+        <w:spacing w:after="60" w:before="60"/>
+      </w:pPr>
+      <w:r>
+        <w:rPr>
+          <w:rFonts w:ascii="Arial" w:cs="Arial" w:eastAsia="Arial" w:hAnsi="Arial"/>
+          <w:color w:val="222222"/>
+          <w:sz w:val="20"/>
+          <w:szCs w:val="20"/>
+        </w:rPr>
+        <w:t xml:space="preserve">Further analysis of the remaining eight event dates in the dataset would constitute a complete event study of geopolitical shocks on crypto payment flows — a research question with genuine academic and industry relevance that has not been systematically addressed in the published literature.</w:t>
       </w:r>
     </w:p>
     <w:p>
@@ -6848,7 +7563,7 @@
                 <w:sz w:val="18"/>
                 <w:szCs w:val="18"/>
               </w:rPr>
-              <w:t xml:space="preserve">Requirement for Stage 3</w:t>
+              <w:t xml:space="preserve">Original Research Contribution</w:t>
             </w:r>
           </w:p>
           <w:p>
@@ -6862,7 +7577,7 @@
                 <w:sz w:val="18"/>
                 <w:szCs w:val="18"/>
               </w:rPr>
-              <w:t xml:space="preserve">Query 10 must be completed and saved as a public query on your Dune account before progressing to Stage 3. The research question, the query, and a brief interpretation of the results must also be added to the blockchain-payments-learning repository on GitHub. This is your first original on-chain research contribution.</w:t>
+              <w:t xml:space="preserve">This query and its findings represent original on-chain research. The combination of a specific geopolitical event timeline with USDC payment flow data produces a novel dataset that directly bridges the geopolitical analysis and blockchain payments strands of this portfolio. Both the query and interpretation are saved publicly at dune.com/@sakicansev.</w:t>
             </w:r>
           </w:p>
         </w:tc>
@@ -7766,7 +8481,7 @@
         </w:rPr>
         <w:t xml:space="preserve">Ethereum: A next-generation smart contract and decentralized application platform. Ethereum Foundation. Available at: </w:t>
       </w:r>
-      <w:hyperlink w:history="1" r:id="rIdpcidqqhfpacq50cwod4-m">
+      <w:hyperlink w:history="1" r:id="rIdelcxtbytlufx2_h2l5lav">
         <w:r>
           <w:rPr>
             <w:rFonts w:ascii="Arial" w:cs="Arial" w:eastAsia="Arial" w:hAnsi="Arial"/>
@@ -7804,7 +8519,7 @@
         </w:rPr>
         <w:t xml:space="preserve">Crypto market manipulation 2025: Suspected wash trading and pump-and-dump schemes. Chainalysis Research. Available at: </w:t>
       </w:r>
-      <w:hyperlink w:history="1" r:id="rIdvagdlqrvdd0hjpw_mhtx2">
+      <w:hyperlink w:history="1" r:id="rIdfr1qohbypsjxmbosl_a-x">
         <w:r>
           <w:rPr>
             <w:rFonts w:ascii="Arial" w:cs="Arial" w:eastAsia="Arial" w:hAnsi="Arial"/>
@@ -7842,7 +8557,7 @@
         </w:rPr>
         <w:t xml:space="preserve">USDC documentation. Circle Developer Portal. Available at: </w:t>
       </w:r>
-      <w:hyperlink w:history="1" r:id="rIdryd7mfqiy2odc2fbnyj9q">
+      <w:hyperlink w:history="1" r:id="rId-pkf9u-oatny8hvtzel-g">
         <w:r>
           <w:rPr>
             <w:rFonts w:ascii="Arial" w:cs="Arial" w:eastAsia="Arial" w:hAnsi="Arial"/>
@@ -7880,7 +8595,7 @@
         </w:rPr>
         <w:t xml:space="preserve">Dune documentation: Getting started with on-chain data analysis. Available at: </w:t>
       </w:r>
-      <w:hyperlink w:history="1" r:id="rIdagfhwupipucc0kay_lui5">
+      <w:hyperlink w:history="1" r:id="rIdtd38pfnxm5skbbyip8nzr">
         <w:r>
           <w:rPr>
             <w:rFonts w:ascii="Arial" w:cs="Arial" w:eastAsia="Arial" w:hAnsi="Arial"/>
@@ -7918,7 +8633,7 @@
         </w:rPr>
         <w:t xml:space="preserve">Ethereum developer documentation: Transactions, gas, and Layer 2. Available at: </w:t>
       </w:r>
-      <w:hyperlink w:history="1" r:id="rId8c8ynqcwr6i_s84hmtjeb">
+      <w:hyperlink w:history="1" r:id="rIde_1kng998du_fupr_v_on">
         <w:r>
           <w:rPr>
             <w:rFonts w:ascii="Arial" w:cs="Arial" w:eastAsia="Arial" w:hAnsi="Arial"/>
@@ -7956,7 +8671,7 @@
         </w:rPr>
         <w:t xml:space="preserve">The Maker Protocol: MakerDAO’s multi-collateral DAI system. Available at: </w:t>
       </w:r>
-      <w:hyperlink w:history="1" r:id="rIdwjfo5wysaaeoqlw-dqcsk">
+      <w:hyperlink w:history="1" r:id="rIdsmsepon-rzrkrdetglcuj">
         <w:r>
           <w:rPr>
             <w:rFonts w:ascii="Arial" w:cs="Arial" w:eastAsia="Arial" w:hAnsi="Arial"/>
@@ -7994,7 +8709,7 @@
         </w:rPr>
         <w:t xml:space="preserve">Bitcoin: A peer-to-peer electronic cash system. Available at: </w:t>
       </w:r>
-      <w:hyperlink w:history="1" r:id="rIdsackhglru-bzsdnwxudim">
+      <w:hyperlink w:history="1" r:id="rIdavoxsm2-cif6ardbqehpp">
         <w:r>
           <w:rPr>
             <w:rFonts w:ascii="Arial" w:cs="Arial" w:eastAsia="Arial" w:hAnsi="Arial"/>
@@ -8058,7 +8773,7 @@
         </w:rPr>
         <w:t xml:space="preserve">The Bitcoin Lightning Network: Scalable off-chain instant payments. Available at: </w:t>
       </w:r>
-      <w:hyperlink w:history="1" r:id="rIdonjpppurewwo9xhdwleyq">
+      <w:hyperlink w:history="1" r:id="rIdjowurd0rpwkzppkvemepv">
         <w:r>
           <w:rPr>
             <w:rFonts w:ascii="Arial" w:cs="Arial" w:eastAsia="Arial" w:hAnsi="Arial"/>

</xml_diff>